<commit_message>
feat: bottom nav reorder, profile sheet merge, filter split, fix excel export on LIFF
</commit_message>
<xml_diff>
--- a/marketing/nookeb-brand-content-playbook-v2.docx
+++ b/marketing/nookeb-brand-content-playbook-v2.docx
@@ -155,7 +155,7 @@
           <w:sz w:val="18"/>
           <w:szCs w:val="18"/>
         </w:rPr>
-        <w:t xml:space="preserve">ทุกข้อมูลฟีเจอร์และตัวเลขในเล่มนี้ตรวจสอบกับระบบจริงแล้ว ณ วันที่จัดทำ</w:t>
+        <w:t>ทุกข้อมูลฟีเจอร์และตัวเลขในเล่มนี้ตรวจสอบกับระบบจริงแล้ว ณ วันที่จัดทำ · ปรับปรุงล่าสุด 22 ก.ค. 2569: เพิ่มระบบรวมไฟล์ PDF · งานส่วนตัวในแชทเดี่ยว · แนบไฟล์และวงจรส่งงานกลับของระบบตามงาน · ห้องทีม · ถอดคำสั่งเปิด/ปิดแจ้งเตือนในกลุ่ม (กลุ่มเก็บไฟล์เงียบเสมอ)</w:t>
       </w:r>
     </w:p>
     <w:p>
@@ -1542,189 +1542,7 @@
           <w:sz w:val="22"/>
           <w:szCs w:val="22"/>
         </w:rPr>
-        <w:t xml:space="preserve">หนูเก็บ (nookeb) คือ </w:t>
-      </w:r>
-      <w:r>
-        <w:rPr>
-          <w:rFonts w:ascii="Leelawad UI" w:cs="Leelawad UI" w:eastAsia="Leelawad UI" w:hAnsi="Leelawad UI"/>
-          <w:b/>
-          <w:bCs/>
-          <w:i w:val="false"/>
-          <w:iCs w:val="false"/>
-          <w:color w:val="111111"/>
-          <w:sz w:val="22"/>
-          <w:szCs w:val="22"/>
-        </w:rPr>
-        <w:t xml:space="preserve">"ที่ฝากของใจกลางไลน์"</w:t>
-      </w:r>
-      <w:r>
-        <w:rPr>
-          <w:rFonts w:ascii="Leelawad UI" w:cs="Leelawad UI" w:eastAsia="Leelawad UI" w:hAnsi="Leelawad UI"/>
-          <w:b w:val="false"/>
-          <w:bCs w:val="false"/>
-          <w:i w:val="false"/>
-          <w:iCs w:val="false"/>
-          <w:color w:val="111111"/>
-          <w:sz w:val="22"/>
-          <w:szCs w:val="22"/>
-        </w:rPr>
-        <w:t xml:space="preserve"> — น้องบอทในไลน์ที่พี่ ๆ ฝากอะไรไว้ก็ได้ แล้วหนูเก็บดูแลให้: </w:t>
-      </w:r>
-      <w:r>
-        <w:rPr>
-          <w:rFonts w:ascii="Leelawad UI" w:cs="Leelawad UI" w:eastAsia="Leelawad UI" w:hAnsi="Leelawad UI"/>
-          <w:b/>
-          <w:bCs/>
-          <w:i w:val="false"/>
-          <w:iCs w:val="false"/>
-          <w:color w:val="111111"/>
-          <w:sz w:val="22"/>
-          <w:szCs w:val="22"/>
-        </w:rPr>
-        <w:t xml:space="preserve">ฝากไฟล์</w:t>
-      </w:r>
-      <w:r>
-        <w:rPr>
-          <w:rFonts w:ascii="Leelawad UI" w:cs="Leelawad UI" w:eastAsia="Leelawad UI" w:hAnsi="Leelawad UI"/>
-          <w:b w:val="false"/>
-          <w:bCs w:val="false"/>
-          <w:i w:val="false"/>
-          <w:iCs w:val="false"/>
-          <w:color w:val="111111"/>
-          <w:sz w:val="22"/>
-          <w:szCs w:val="22"/>
-        </w:rPr>
-        <w:t xml:space="preserve"> (ส่งรูป เอกสาร วิดีโอ เสียง เข้าแชท → เข้า "ล็อคเกอร์" บนคลาวด์ทันที), </w:t>
-      </w:r>
-      <w:r>
-        <w:rPr>
-          <w:rFonts w:ascii="Leelawad UI" w:cs="Leelawad UI" w:eastAsia="Leelawad UI" w:hAnsi="Leelawad UI"/>
-          <w:b/>
-          <w:bCs/>
-          <w:i w:val="false"/>
-          <w:iCs w:val="false"/>
-          <w:color w:val="111111"/>
-          <w:sz w:val="22"/>
-          <w:szCs w:val="22"/>
-        </w:rPr>
-        <w:t xml:space="preserve">ฝากเอกสาร</w:t>
-      </w:r>
-      <w:r>
-        <w:rPr>
-          <w:rFonts w:ascii="Leelawad UI" w:cs="Leelawad UI" w:eastAsia="Leelawad UI" w:hAnsi="Leelawad UI"/>
-          <w:b w:val="false"/>
-          <w:bCs w:val="false"/>
-          <w:i w:val="false"/>
-          <w:iCs w:val="false"/>
-          <w:color w:val="111111"/>
-          <w:sz w:val="22"/>
-          <w:szCs w:val="22"/>
-        </w:rPr>
-        <w:t xml:space="preserve"> (สแกนเป็น PDF / แปลงเป็น Word / ค้นด้วยตัวหนังสือในรูป), </w:t>
-      </w:r>
-      <w:r>
-        <w:rPr>
-          <w:rFonts w:ascii="Leelawad UI" w:cs="Leelawad UI" w:eastAsia="Leelawad UI" w:hAnsi="Leelawad UI"/>
-          <w:b/>
-          <w:bCs/>
-          <w:i w:val="false"/>
-          <w:iCs w:val="false"/>
-          <w:color w:val="111111"/>
-          <w:sz w:val="22"/>
-          <w:szCs w:val="22"/>
-        </w:rPr>
-        <w:t xml:space="preserve">ฝากตามงาน</w:t>
-      </w:r>
-      <w:r>
-        <w:rPr>
-          <w:rFonts w:ascii="Leelawad UI" w:cs="Leelawad UI" w:eastAsia="Leelawad UI" w:hAnsi="Leelawad UI"/>
-          <w:b w:val="false"/>
-          <w:bCs w:val="false"/>
-          <w:i w:val="false"/>
-          <w:iCs w:val="false"/>
-          <w:color w:val="111111"/>
-          <w:sz w:val="22"/>
-          <w:szCs w:val="22"/>
-        </w:rPr>
-        <w:t xml:space="preserve"> (ตั้งงานในกลุ่มแล้วมอบหมายให้สมาชิก), </w:t>
-      </w:r>
-      <w:r>
-        <w:rPr>
-          <w:rFonts w:ascii="Leelawad UI" w:cs="Leelawad UI" w:eastAsia="Leelawad UI" w:hAnsi="Leelawad UI"/>
-          <w:b/>
-          <w:bCs/>
-          <w:i w:val="false"/>
-          <w:iCs w:val="false"/>
-          <w:color w:val="111111"/>
-          <w:sz w:val="22"/>
-          <w:szCs w:val="22"/>
-        </w:rPr>
-        <w:t xml:space="preserve">ฝากความทรงจำ</w:t>
-      </w:r>
-      <w:r>
-        <w:rPr>
-          <w:rFonts w:ascii="Leelawad UI" w:cs="Leelawad UI" w:eastAsia="Leelawad UI" w:hAnsi="Leelawad UI"/>
-          <w:b w:val="false"/>
-          <w:bCs w:val="false"/>
-          <w:i w:val="false"/>
-          <w:iCs w:val="false"/>
-          <w:color w:val="111111"/>
-          <w:sz w:val="22"/>
-          <w:szCs w:val="22"/>
-        </w:rPr>
-        <w:t xml:space="preserve"> (ไดอารี่วันละรูปทั้งปี), </w:t>
-      </w:r>
-      <w:r>
-        <w:rPr>
-          <w:rFonts w:ascii="Leelawad UI" w:cs="Leelawad UI" w:eastAsia="Leelawad UI" w:hAnsi="Leelawad UI"/>
-          <w:b/>
-          <w:bCs/>
-          <w:i w:val="false"/>
-          <w:iCs w:val="false"/>
-          <w:color w:val="111111"/>
-          <w:sz w:val="22"/>
-          <w:szCs w:val="22"/>
-        </w:rPr>
-        <w:t xml:space="preserve">ฝากของลับ</w:t>
-      </w:r>
-      <w:r>
-        <w:rPr>
-          <w:rFonts w:ascii="Leelawad UI" w:cs="Leelawad UI" w:eastAsia="Leelawad UI" w:hAnsi="Leelawad UI"/>
-          <w:b w:val="false"/>
-          <w:bCs w:val="false"/>
-          <w:i w:val="false"/>
-          <w:iCs w:val="false"/>
-          <w:color w:val="111111"/>
-          <w:sz w:val="22"/>
-          <w:szCs w:val="22"/>
-        </w:rPr>
-        <w:t xml:space="preserve"> (ห้องนิรภัยล็อกด้วย PIN) และ </w:t>
-      </w:r>
-      <w:r>
-        <w:rPr>
-          <w:rFonts w:ascii="Leelawad UI" w:cs="Leelawad UI" w:eastAsia="Leelawad UI" w:hAnsi="Leelawad UI"/>
-          <w:b/>
-          <w:bCs/>
-          <w:i w:val="false"/>
-          <w:iCs w:val="false"/>
-          <w:color w:val="111111"/>
-          <w:sz w:val="22"/>
-          <w:szCs w:val="22"/>
-        </w:rPr>
-        <w:t xml:space="preserve">ฝากส่งให้กัน</w:t>
-      </w:r>
-      <w:r>
-        <w:rPr>
-          <w:rFonts w:ascii="Leelawad UI" w:cs="Leelawad UI" w:eastAsia="Leelawad UI" w:hAnsi="Leelawad UI"/>
-          <w:b w:val="false"/>
-          <w:bCs w:val="false"/>
-          <w:i w:val="false"/>
-          <w:iCs w:val="false"/>
-          <w:color w:val="111111"/>
-          <w:sz w:val="22"/>
-          <w:szCs w:val="22"/>
-        </w:rPr>
-        <w:t xml:space="preserve"> (กล่องของขวัญส่งรูป+ข้อความ+เสียงให้คนพิเศษ) เปิดใช้ผ่านเว็บด้วยการล็อกอินด้วย LINE — ไม่ต้องสมัครสมาชิกใหม่ ไม่ต้องจำรหัสผ่าน ไม่ต้องโหลดแอปเพิ่ม</w:t>
+        <w:t>หนูเก็บ (nookeb) คือ "ที่ฝากของใจกลางไลน์" — น้องบอทในไลน์ที่พี่ ๆ ฝากอะไรไว้ก็ได้ แล้วหนูเก็บดูแลให้: ฝากไฟล์ (ส่งรูป เอกสาร วิดีโอ เสียง เข้าแชท → เข้า "ล็อคเกอร์" บนคลาวด์ทันที), ฝากเอกสาร (สแกนเป็น PDF / รวมไฟล์ PDF หลายไฟล์เป็นไฟล์เดียว / แปลงเป็น Word / ค้นด้วยตัวหนังสือในรูป), ฝากตามงาน (ตั้งงานในกลุ่มแล้วมอบหมายให้สมาชิก หรือจดงานส่วนตัวไว้ในแชทเดี่ยว), ฝากความทรงจำ (ไดอารี่วันละรูปทั้งปี), ฝากของลับ (ห้องนิรภัยล็อกด้วย PIN) และ ฝากส่งให้กัน (กล่องของขวัญส่งรูป+ข้อความ+เสียงให้คนพิเศษ) เปิดใช้ผ่านเว็บด้วยการล็อกอินด้วย LINE — ไม่ต้องสมัครสมาชิกใหม่ ไม่ต้องจำรหัสผ่าน ไม่ต้องโหลดแอปเพิ่ม</w:t>
       </w:r>
     </w:p>
     <w:p>
@@ -2112,7 +1930,7 @@
                 <w:sz w:val="22"/>
                 <w:szCs w:val="22"/>
               </w:rPr>
-              <w:t xml:space="preserve">ล็อคเกอร์ · สแกน · แปลง Word · ค้นหา OCR</w:t>
+              <w:t>ล็อคเกอร์ · สแกน · รวมรูป · รวมไฟล์ PDF · แปลง Word · ค้นหา OCR</w:t>
             </w:r>
           </w:p>
         </w:tc>
@@ -2203,7 +2021,7 @@
                 <w:sz w:val="22"/>
                 <w:szCs w:val="22"/>
               </w:rPr>
-              <w:t xml:space="preserve">ตามงาน (Task) ในกลุ่ม</w:t>
+              <w:t>ตามงาน (Task) — ในกลุ่ม และงานส่วนตัวในแชทเดี่ยว</w:t>
             </w:r>
           </w:p>
         </w:tc>
@@ -2233,7 +2051,7 @@
                 <w:sz w:val="22"/>
                 <w:szCs w:val="22"/>
               </w:rPr>
-              <w:t xml:space="preserve">"ตั้งงานในกลุ่ม มอบหมายใครก็ได้ หนูเก็บประกาศให้ทั้งกลุ่มเห็น"</w:t>
+              <w:t>"ตั้งงานในกลุ่ม มอบหมายใครก็ได้ หนูเก็บประกาศให้ทั้งกลุ่มเห็น — หรือจดงานของตัวเองไว้ในแชทเดี่ยวก็ได้"</w:t>
             </w:r>
           </w:p>
         </w:tc>
@@ -3984,90 +3802,87 @@
         <w:tc>
           <w:tcPr>
             <w:tcW w:type="dxa" w:w="2100"/>
-            <w:shd w:fill="FAFAFA" w:val="clear"/>
-            <w:tcMar>
-              <w:top w:type="dxa" w:w="60"/>
-              <w:left w:type="dxa" w:w="100"/>
-              <w:bottom w:type="dxa" w:w="60"/>
-              <w:right w:type="dxa" w:w="100"/>
-            </w:tcMar>
-          </w:tcPr>
-          <w:p>
-            <w:pPr>
-              <w:spacing w:after="40"/>
-            </w:pPr>
-            <w:r>
-              <w:rPr>
-                <w:rFonts w:ascii="Leelawad UI" w:cs="Leelawad UI" w:eastAsia="Leelawad UI" w:hAnsi="Leelawad UI"/>
-                <w:b w:val="false"/>
-                <w:bCs w:val="false"/>
-                <w:i w:val="false"/>
-                <w:iCs w:val="false"/>
-                <w:color w:val="111111"/>
-                <w:sz w:val="22"/>
-                <w:szCs w:val="22"/>
-              </w:rPr>
-              <w:t xml:space="preserve">แปลงรูป/PDF เป็น Word</w:t>
+            <w:tcMar>
+              <w:top w:type="dxa" w:w="60"/>
+              <w:left w:type="dxa" w:w="100"/>
+              <w:bottom w:type="dxa" w:w="60"/>
+              <w:right w:type="dxa" w:w="100"/>
+            </w:tcMar>
+          </w:tcPr>
+          <w:p>
+            <w:pPr>
+              <w:spacing w:after="40"/>
+            </w:pPr>
+            <w:r>
+              <w:rPr>
+                <w:rFonts w:ascii="Leelawad UI" w:cs="Leelawad UI" w:eastAsia="Leelawad UI" w:hAnsi="Leelawad UI"/>
+                <w:b w:val="false"/>
+                <w:bCs w:val="false"/>
+                <w:i w:val="false"/>
+                <w:iCs w:val="false"/>
+                <w:color w:val="111111"/>
+                <w:sz w:val="22"/>
+                <w:szCs w:val="22"/>
+              </w:rPr>
+              <w:t>รวมไฟล์ PDF หลายไฟล์เป็นไฟล์เดียว</w:t>
             </w:r>
           </w:p>
         </w:tc>
         <w:tc>
           <w:tcPr>
             <w:tcW w:type="dxa" w:w="3500"/>
-            <w:shd w:fill="FAFAFA" w:val="clear"/>
-            <w:tcMar>
-              <w:top w:type="dxa" w:w="60"/>
-              <w:left w:type="dxa" w:w="100"/>
-              <w:bottom w:type="dxa" w:w="60"/>
-              <w:right w:type="dxa" w:w="100"/>
-            </w:tcMar>
-          </w:tcPr>
-          <w:p>
-            <w:pPr>
-              <w:spacing w:after="40"/>
-            </w:pPr>
-            <w:r>
-              <w:rPr>
-                <w:rFonts w:ascii="Leelawad UI" w:cs="Leelawad UI" w:eastAsia="Leelawad UI" w:hAnsi="Leelawad UI"/>
-                <w:b w:val="false"/>
-                <w:bCs w:val="false"/>
-                <w:i w:val="false"/>
-                <w:iCs w:val="false"/>
-                <w:color w:val="111111"/>
-                <w:sz w:val="22"/>
-                <w:szCs w:val="22"/>
-              </w:rPr>
-              <w:t xml:space="preserve">พิมพ์ "หนูเก็บแปลงไฟล์" → ส่งรูปหรือ PDF (ไม่เกิน 10 MB) → AI อ่านเอกสารแล้วสร้างไฟล์ .docx ที่แก้ไขต่อได้ (แชทส่วนตัวเท่านั้น เอกสารตัวพิมพ์ชัด ๆ ได้ผลดีที่สุด)</w:t>
+            <w:tcMar>
+              <w:top w:type="dxa" w:w="60"/>
+              <w:left w:type="dxa" w:w="100"/>
+              <w:bottom w:type="dxa" w:w="60"/>
+              <w:right w:type="dxa" w:w="100"/>
+            </w:tcMar>
+          </w:tcPr>
+          <w:p>
+            <w:pPr>
+              <w:spacing w:after="40"/>
+            </w:pPr>
+            <w:r>
+              <w:rPr>
+                <w:rFonts w:ascii="Leelawad UI" w:cs="Leelawad UI" w:eastAsia="Leelawad UI" w:hAnsi="Leelawad UI"/>
+                <w:b w:val="false"/>
+                <w:bCs w:val="false"/>
+                <w:i w:val="false"/>
+                <w:iCs w:val="false"/>
+                <w:color w:val="111111"/>
+                <w:sz w:val="22"/>
+                <w:szCs w:val="22"/>
+              </w:rPr>
+              <w:t>พิมพ์ "หนูเก็บรวมไฟล์" → ส่งไฟล์ PDF ทีละไฟล์ (ไฟล์ละไม่เกิน 20 MB สูงสุด 20 ไฟล์) → พิมพ์ "เสร็จ" → ได้ PDF ไฟล์เดียวที่เรียงตามลำดับที่ส่ง หน้าเดิมคมชัดเท่าเดิม ไม่บีบอัดซ้ำ (ใช้ในแชทส่วนตัวเท่านั้น · รับเฉพาะไฟล์ .pdf)</w:t>
             </w:r>
           </w:p>
         </w:tc>
         <w:tc>
           <w:tcPr>
             <w:tcW w:type="dxa" w:w="3426"/>
-            <w:shd w:fill="FAFAFA" w:val="clear"/>
-            <w:tcMar>
-              <w:top w:type="dxa" w:w="60"/>
-              <w:left w:type="dxa" w:w="100"/>
-              <w:bottom w:type="dxa" w:w="60"/>
-              <w:right w:type="dxa" w:w="100"/>
-            </w:tcMar>
-          </w:tcPr>
-          <w:p>
-            <w:pPr>
-              <w:spacing w:after="40"/>
-            </w:pPr>
-            <w:r>
-              <w:rPr>
-                <w:rFonts w:ascii="Leelawad UI" w:cs="Leelawad UI" w:eastAsia="Leelawad UI" w:hAnsi="Leelawad UI"/>
-                <w:b w:val="false"/>
-                <w:bCs w:val="false"/>
-                <w:i w:val="false"/>
-                <w:iCs w:val="false"/>
-                <w:color w:val="111111"/>
-                <w:sz w:val="22"/>
-                <w:szCs w:val="22"/>
-              </w:rPr>
-              <w:t xml:space="preserve">"ถ่ายรูปเอกสารมา หนูเก็บแปลงเป็นไฟล์ Word ให้แก้ต่อได้เลย" (ก่อนโปรโมทให้เช็คว่าฟีเจอร์เปิดใช้งานอยู่)</w:t>
+            <w:tcMar>
+              <w:top w:type="dxa" w:w="60"/>
+              <w:left w:type="dxa" w:w="100"/>
+              <w:bottom w:type="dxa" w:w="60"/>
+              <w:right w:type="dxa" w:w="100"/>
+            </w:tcMar>
+          </w:tcPr>
+          <w:p>
+            <w:pPr>
+              <w:spacing w:after="40"/>
+            </w:pPr>
+            <w:r>
+              <w:rPr>
+                <w:rFonts w:ascii="Leelawad UI" w:cs="Leelawad UI" w:eastAsia="Leelawad UI" w:hAnsi="Leelawad UI"/>
+                <w:b w:val="false"/>
+                <w:bCs w:val="false"/>
+                <w:i w:val="false"/>
+                <w:iCs w:val="false"/>
+                <w:color w:val="111111"/>
+                <w:sz w:val="22"/>
+                <w:szCs w:val="22"/>
+              </w:rPr>
+              <w:t>"มี PDF หลายไฟล์ ส่งให้หนูเก็บรวมเป็นไฟล์เดียวได้เลย ไม่ต้องพึ่งเว็บรวมไฟล์"</w:t>
             </w:r>
           </w:p>
         </w:tc>
@@ -4076,87 +3891,90 @@
         <w:tc>
           <w:tcPr>
             <w:tcW w:type="dxa" w:w="2100"/>
-            <w:tcMar>
-              <w:top w:type="dxa" w:w="60"/>
-              <w:left w:type="dxa" w:w="100"/>
-              <w:bottom w:type="dxa" w:w="60"/>
-              <w:right w:type="dxa" w:w="100"/>
-            </w:tcMar>
-          </w:tcPr>
-          <w:p>
-            <w:pPr>
-              <w:spacing w:after="40"/>
-            </w:pPr>
-            <w:r>
-              <w:rPr>
-                <w:rFonts w:ascii="Leelawad UI" w:cs="Leelawad UI" w:eastAsia="Leelawad UI" w:hAnsi="Leelawad UI"/>
-                <w:b w:val="false"/>
-                <w:bCs w:val="false"/>
-                <w:i w:val="false"/>
-                <w:iCs w:val="false"/>
-                <w:color w:val="111111"/>
-                <w:sz w:val="22"/>
-                <w:szCs w:val="22"/>
-              </w:rPr>
-              <w:t xml:space="preserve">ไดอารี่ 365 วัน</w:t>
+            <w:shd w:fill="FAFAFA" w:val="clear"/>
+            <w:tcMar>
+              <w:top w:type="dxa" w:w="60"/>
+              <w:left w:type="dxa" w:w="100"/>
+              <w:bottom w:type="dxa" w:w="60"/>
+              <w:right w:type="dxa" w:w="100"/>
+            </w:tcMar>
+          </w:tcPr>
+          <w:p>
+            <w:pPr>
+              <w:spacing w:after="40"/>
+            </w:pPr>
+            <w:r>
+              <w:rPr>
+                <w:rFonts w:ascii="Leelawad UI" w:cs="Leelawad UI" w:eastAsia="Leelawad UI" w:hAnsi="Leelawad UI"/>
+                <w:b w:val="false"/>
+                <w:bCs w:val="false"/>
+                <w:i w:val="false"/>
+                <w:iCs w:val="false"/>
+                <w:color w:val="111111"/>
+                <w:sz w:val="22"/>
+                <w:szCs w:val="22"/>
+              </w:rPr>
+              <w:t xml:space="preserve">แปลงรูป/PDF เป็น Word</w:t>
             </w:r>
           </w:p>
         </w:tc>
         <w:tc>
           <w:tcPr>
             <w:tcW w:type="dxa" w:w="3500"/>
-            <w:tcMar>
-              <w:top w:type="dxa" w:w="60"/>
-              <w:left w:type="dxa" w:w="100"/>
-              <w:bottom w:type="dxa" w:w="60"/>
-              <w:right w:type="dxa" w:w="100"/>
-            </w:tcMar>
-          </w:tcPr>
-          <w:p>
-            <w:pPr>
-              <w:spacing w:after="40"/>
-            </w:pPr>
-            <w:r>
-              <w:rPr>
-                <w:rFonts w:ascii="Leelawad UI" w:cs="Leelawad UI" w:eastAsia="Leelawad UI" w:hAnsi="Leelawad UI"/>
-                <w:b w:val="false"/>
-                <w:bCs w:val="false"/>
-                <w:i w:val="false"/>
-                <w:iCs w:val="false"/>
-                <w:color w:val="111111"/>
-                <w:sz w:val="22"/>
-                <w:szCs w:val="22"/>
-              </w:rPr>
-              <w:t xml:space="preserve">พิมพ์ "หนูเก็บไดอารี่" → ส่งรูป 1 รูป (พิมพ์แคปชั่นก่อนส่งรูปได้) → บันทึกเป็นไดอารี่ของวันนั้น ดูเป็นตาราง 365 ช่อง + นับ streak วันติดต่อกันบนเว็บ (วันละ 1 รูป รูปไม่เกิน 10 MB)</w:t>
+            <w:shd w:fill="FAFAFA" w:val="clear"/>
+            <w:tcMar>
+              <w:top w:type="dxa" w:w="60"/>
+              <w:left w:type="dxa" w:w="100"/>
+              <w:bottom w:type="dxa" w:w="60"/>
+              <w:right w:type="dxa" w:w="100"/>
+            </w:tcMar>
+          </w:tcPr>
+          <w:p>
+            <w:pPr>
+              <w:spacing w:after="40"/>
+            </w:pPr>
+            <w:r>
+              <w:rPr>
+                <w:rFonts w:ascii="Leelawad UI" w:cs="Leelawad UI" w:eastAsia="Leelawad UI" w:hAnsi="Leelawad UI"/>
+                <w:b w:val="false"/>
+                <w:bCs w:val="false"/>
+                <w:i w:val="false"/>
+                <w:iCs w:val="false"/>
+                <w:color w:val="111111"/>
+                <w:sz w:val="22"/>
+                <w:szCs w:val="22"/>
+              </w:rPr>
+              <w:t xml:space="preserve">พิมพ์ "หนูเก็บแปลงไฟล์" → ส่งรูปหรือ PDF (ไม่เกิน 10 MB) → AI อ่านเอกสารแล้วสร้างไฟล์ .docx ที่แก้ไขต่อได้ (แชทส่วนตัวเท่านั้น เอกสารตัวพิมพ์ชัด ๆ ได้ผลดีที่สุด)</w:t>
             </w:r>
           </w:p>
         </w:tc>
         <w:tc>
           <w:tcPr>
             <w:tcW w:type="dxa" w:w="3426"/>
-            <w:tcMar>
-              <w:top w:type="dxa" w:w="60"/>
-              <w:left w:type="dxa" w:w="100"/>
-              <w:bottom w:type="dxa" w:w="60"/>
-              <w:right w:type="dxa" w:w="100"/>
-            </w:tcMar>
-          </w:tcPr>
-          <w:p>
-            <w:pPr>
-              <w:spacing w:after="40"/>
-            </w:pPr>
-            <w:r>
-              <w:rPr>
-                <w:rFonts w:ascii="Leelawad UI" w:cs="Leelawad UI" w:eastAsia="Leelawad UI" w:hAnsi="Leelawad UI"/>
-                <w:b w:val="false"/>
-                <w:bCs w:val="false"/>
-                <w:i w:val="false"/>
-                <w:iCs w:val="false"/>
-                <w:color w:val="111111"/>
-                <w:sz w:val="22"/>
-                <w:szCs w:val="22"/>
-              </w:rPr>
-              <w:t xml:space="preserve">"ถ่ายรูปวันละรูป เก็บครบปี — มี streak ให้สะสมเหมือนเกม เปิดย้อนดูความทรงจำได้ทั้งปี"</w:t>
+            <w:shd w:fill="FAFAFA" w:val="clear"/>
+            <w:tcMar>
+              <w:top w:type="dxa" w:w="60"/>
+              <w:left w:type="dxa" w:w="100"/>
+              <w:bottom w:type="dxa" w:w="60"/>
+              <w:right w:type="dxa" w:w="100"/>
+            </w:tcMar>
+          </w:tcPr>
+          <w:p>
+            <w:pPr>
+              <w:spacing w:after="40"/>
+            </w:pPr>
+            <w:r>
+              <w:rPr>
+                <w:rFonts w:ascii="Leelawad UI" w:cs="Leelawad UI" w:eastAsia="Leelawad UI" w:hAnsi="Leelawad UI"/>
+                <w:b w:val="false"/>
+                <w:bCs w:val="false"/>
+                <w:i w:val="false"/>
+                <w:iCs w:val="false"/>
+                <w:color w:val="111111"/>
+                <w:sz w:val="22"/>
+                <w:szCs w:val="22"/>
+              </w:rPr>
+              <w:t xml:space="preserve">"ถ่ายรูปเอกสารมา หนูเก็บแปลงเป็นไฟล์ Word ให้แก้ต่อได้เลย" (ก่อนโปรโมทให้เช็คว่าฟีเจอร์เปิดใช้งานอยู่)</w:t>
             </w:r>
           </w:p>
         </w:tc>
@@ -4165,90 +3983,87 @@
         <w:tc>
           <w:tcPr>
             <w:tcW w:type="dxa" w:w="2100"/>
-            <w:shd w:fill="FAFAFA" w:val="clear"/>
-            <w:tcMar>
-              <w:top w:type="dxa" w:w="60"/>
-              <w:left w:type="dxa" w:w="100"/>
-              <w:bottom w:type="dxa" w:w="60"/>
-              <w:right w:type="dxa" w:w="100"/>
-            </w:tcMar>
-          </w:tcPr>
-          <w:p>
-            <w:pPr>
-              <w:spacing w:after="40"/>
-            </w:pPr>
-            <w:r>
-              <w:rPr>
-                <w:rFonts w:ascii="Leelawad UI" w:cs="Leelawad UI" w:eastAsia="Leelawad UI" w:hAnsi="Leelawad UI"/>
-                <w:b w:val="false"/>
-                <w:bCs w:val="false"/>
-                <w:i w:val="false"/>
-                <w:iCs w:val="false"/>
-                <w:color w:val="111111"/>
-                <w:sz w:val="22"/>
-                <w:szCs w:val="22"/>
-              </w:rPr>
-              <w:t xml:space="preserve">กลุ่ม &amp; ทีม</w:t>
+            <w:tcMar>
+              <w:top w:type="dxa" w:w="60"/>
+              <w:left w:type="dxa" w:w="100"/>
+              <w:bottom w:type="dxa" w:w="60"/>
+              <w:right w:type="dxa" w:w="100"/>
+            </w:tcMar>
+          </w:tcPr>
+          <w:p>
+            <w:pPr>
+              <w:spacing w:after="40"/>
+            </w:pPr>
+            <w:r>
+              <w:rPr>
+                <w:rFonts w:ascii="Leelawad UI" w:cs="Leelawad UI" w:eastAsia="Leelawad UI" w:hAnsi="Leelawad UI"/>
+                <w:b w:val="false"/>
+                <w:bCs w:val="false"/>
+                <w:i w:val="false"/>
+                <w:iCs w:val="false"/>
+                <w:color w:val="111111"/>
+                <w:sz w:val="22"/>
+                <w:szCs w:val="22"/>
+              </w:rPr>
+              <w:t xml:space="preserve">ไดอารี่ 365 วัน</w:t>
             </w:r>
           </w:p>
         </w:tc>
         <w:tc>
           <w:tcPr>
             <w:tcW w:type="dxa" w:w="3500"/>
-            <w:shd w:fill="FAFAFA" w:val="clear"/>
-            <w:tcMar>
-              <w:top w:type="dxa" w:w="60"/>
-              <w:left w:type="dxa" w:w="100"/>
-              <w:bottom w:type="dxa" w:w="60"/>
-              <w:right w:type="dxa" w:w="100"/>
-            </w:tcMar>
-          </w:tcPr>
-          <w:p>
-            <w:pPr>
-              <w:spacing w:after="40"/>
-            </w:pPr>
-            <w:r>
-              <w:rPr>
-                <w:rFonts w:ascii="Leelawad UI" w:cs="Leelawad UI" w:eastAsia="Leelawad UI" w:hAnsi="Leelawad UI"/>
-                <w:b w:val="false"/>
-                <w:bCs w:val="false"/>
-                <w:i w:val="false"/>
-                <w:iCs w:val="false"/>
-                <w:color w:val="111111"/>
-                <w:sz w:val="22"/>
-                <w:szCs w:val="22"/>
-              </w:rPr>
-              <w:t xml:space="preserve">เชิญหนูเก็บเข้ากลุ่มไลน์ → ไฟล์ที่สมาชิกส่งในกลุ่ม "หลังจากนั้น" ถูกเก็บเข้าพื้นที่กลางของกลุ่มอัตโนมัติ ผูกกลุ่มกับทีมในแดชบอร์ดได้ สั่งให้เก็บแบบเงียบ ๆ ได้ ("หนูเก็บปิดแจ้งเตือน")</w:t>
+            <w:tcMar>
+              <w:top w:type="dxa" w:w="60"/>
+              <w:left w:type="dxa" w:w="100"/>
+              <w:bottom w:type="dxa" w:w="60"/>
+              <w:right w:type="dxa" w:w="100"/>
+            </w:tcMar>
+          </w:tcPr>
+          <w:p>
+            <w:pPr>
+              <w:spacing w:after="40"/>
+            </w:pPr>
+            <w:r>
+              <w:rPr>
+                <w:rFonts w:ascii="Leelawad UI" w:cs="Leelawad UI" w:eastAsia="Leelawad UI" w:hAnsi="Leelawad UI"/>
+                <w:b w:val="false"/>
+                <w:bCs w:val="false"/>
+                <w:i w:val="false"/>
+                <w:iCs w:val="false"/>
+                <w:color w:val="111111"/>
+                <w:sz w:val="22"/>
+                <w:szCs w:val="22"/>
+              </w:rPr>
+              <w:t xml:space="preserve">พิมพ์ "หนูเก็บไดอารี่" → ส่งรูป 1 รูป (พิมพ์แคปชั่นก่อนส่งรูปได้) → บันทึกเป็นไดอารี่ของวันนั้น ดูเป็นตาราง 365 ช่อง + นับ streak วันติดต่อกันบนเว็บ (วันละ 1 รูป รูปไม่เกิน 10 MB)</w:t>
             </w:r>
           </w:p>
         </w:tc>
         <w:tc>
           <w:tcPr>
             <w:tcW w:type="dxa" w:w="3426"/>
-            <w:shd w:fill="FAFAFA" w:val="clear"/>
-            <w:tcMar>
-              <w:top w:type="dxa" w:w="60"/>
-              <w:left w:type="dxa" w:w="100"/>
-              <w:bottom w:type="dxa" w:w="60"/>
-              <w:right w:type="dxa" w:w="100"/>
-            </w:tcMar>
-          </w:tcPr>
-          <w:p>
-            <w:pPr>
-              <w:spacing w:after="40"/>
-            </w:pPr>
-            <w:r>
-              <w:rPr>
-                <w:rFonts w:ascii="Leelawad UI" w:cs="Leelawad UI" w:eastAsia="Leelawad UI" w:hAnsi="Leelawad UI"/>
-                <w:b w:val="false"/>
-                <w:bCs w:val="false"/>
-                <w:i w:val="false"/>
-                <w:iCs w:val="false"/>
-                <w:color w:val="111111"/>
-                <w:sz w:val="22"/>
-                <w:szCs w:val="22"/>
-              </w:rPr>
-              <w:t xml:space="preserve">"ดึงหนูเก็บเข้ากลุ่ม แล้วไฟล์ของทั้งกลุ่มจะไม่หายอีกเลย — ใครส่งอะไร เก็บให้หมด"</w:t>
+            <w:tcMar>
+              <w:top w:type="dxa" w:w="60"/>
+              <w:left w:type="dxa" w:w="100"/>
+              <w:bottom w:type="dxa" w:w="60"/>
+              <w:right w:type="dxa" w:w="100"/>
+            </w:tcMar>
+          </w:tcPr>
+          <w:p>
+            <w:pPr>
+              <w:spacing w:after="40"/>
+            </w:pPr>
+            <w:r>
+              <w:rPr>
+                <w:rFonts w:ascii="Leelawad UI" w:cs="Leelawad UI" w:eastAsia="Leelawad UI" w:hAnsi="Leelawad UI"/>
+                <w:b w:val="false"/>
+                <w:bCs w:val="false"/>
+                <w:i w:val="false"/>
+                <w:iCs w:val="false"/>
+                <w:color w:val="111111"/>
+                <w:sz w:val="22"/>
+                <w:szCs w:val="22"/>
+              </w:rPr>
+              <w:t xml:space="preserve">"ถ่ายรูปวันละรูป เก็บครบปี — มี streak ให้สะสมเหมือนเกม เปิดย้อนดูความทรงจำได้ทั้งปี"</w:t>
             </w:r>
           </w:p>
         </w:tc>
@@ -4257,87 +4072,179 @@
         <w:tc>
           <w:tcPr>
             <w:tcW w:type="dxa" w:w="2100"/>
-            <w:tcMar>
-              <w:top w:type="dxa" w:w="60"/>
-              <w:left w:type="dxa" w:w="100"/>
-              <w:bottom w:type="dxa" w:w="60"/>
-              <w:right w:type="dxa" w:w="100"/>
-            </w:tcMar>
-          </w:tcPr>
-          <w:p>
-            <w:pPr>
-              <w:spacing w:after="40"/>
-            </w:pPr>
-            <w:r>
-              <w:rPr>
-                <w:rFonts w:ascii="Leelawad UI" w:cs="Leelawad UI" w:eastAsia="Leelawad UI" w:hAnsi="Leelawad UI"/>
-                <w:b w:val="false"/>
-                <w:bCs w:val="false"/>
-                <w:i w:val="false"/>
-                <w:iCs w:val="false"/>
-                <w:color w:val="111111"/>
-                <w:sz w:val="22"/>
-                <w:szCs w:val="22"/>
-              </w:rPr>
-              <w:t xml:space="preserve">ตามงาน (Task) ในกลุ่ม</w:t>
+            <w:shd w:fill="FAFAFA" w:val="clear"/>
+            <w:tcMar>
+              <w:top w:type="dxa" w:w="60"/>
+              <w:left w:type="dxa" w:w="100"/>
+              <w:bottom w:type="dxa" w:w="60"/>
+              <w:right w:type="dxa" w:w="100"/>
+            </w:tcMar>
+          </w:tcPr>
+          <w:p>
+            <w:pPr>
+              <w:spacing w:after="40"/>
+            </w:pPr>
+            <w:r>
+              <w:rPr>
+                <w:rFonts w:ascii="Leelawad UI" w:cs="Leelawad UI" w:eastAsia="Leelawad UI" w:hAnsi="Leelawad UI"/>
+                <w:b w:val="false"/>
+                <w:bCs w:val="false"/>
+                <w:i w:val="false"/>
+                <w:iCs w:val="false"/>
+                <w:color w:val="111111"/>
+                <w:sz w:val="22"/>
+                <w:szCs w:val="22"/>
+              </w:rPr>
+              <w:t xml:space="preserve">กลุ่ม &amp; ทีม</w:t>
             </w:r>
           </w:p>
         </w:tc>
         <w:tc>
           <w:tcPr>
             <w:tcW w:type="dxa" w:w="3500"/>
-            <w:tcMar>
-              <w:top w:type="dxa" w:w="60"/>
-              <w:left w:type="dxa" w:w="100"/>
-              <w:bottom w:type="dxa" w:w="60"/>
-              <w:right w:type="dxa" w:w="100"/>
-            </w:tcMar>
-          </w:tcPr>
-          <w:p>
-            <w:pPr>
-              <w:spacing w:after="40"/>
-            </w:pPr>
-            <w:r>
-              <w:rPr>
-                <w:rFonts w:ascii="Leelawad UI" w:cs="Leelawad UI" w:eastAsia="Leelawad UI" w:hAnsi="Leelawad UI"/>
-                <w:b w:val="false"/>
-                <w:bCs w:val="false"/>
-                <w:i w:val="false"/>
-                <w:iCs w:val="false"/>
-                <w:color w:val="111111"/>
-                <w:sz w:val="22"/>
-                <w:szCs w:val="22"/>
-              </w:rPr>
-              <w:t xml:space="preserve">ในกลุ่มไลน์ กดสร้างงานผ่านหน้าเว็บ LIFF → เลือกแบบงาน: งานเดี่ยว / งานหลายรายการ (แยกผู้รับผิดชอบ+กำหนดส่งรายข้อ) / งานประจำ (ทำซ้ำตามรอบ) → มอบหมายให้สมาชิกในกลุ่ม → หนูเก็บโพสต์การ์ดประกาศงานเข้ากลุ่ม กดปุ่ม "รับงาน/เสร็จแล้ว" ได้ในกลุ่ม ดาวน์โหลดไฟล์ปฏิทิน (.ics) เข้าปฏิทินมือถือได้</w:t>
+            <w:shd w:fill="FAFAFA" w:val="clear"/>
+            <w:tcMar>
+              <w:top w:type="dxa" w:w="60"/>
+              <w:left w:type="dxa" w:w="100"/>
+              <w:bottom w:type="dxa" w:w="60"/>
+              <w:right w:type="dxa" w:w="100"/>
+            </w:tcMar>
+          </w:tcPr>
+          <w:p>
+            <w:pPr>
+              <w:spacing w:after="40"/>
+            </w:pPr>
+            <w:r>
+              <w:rPr>
+                <w:rFonts w:ascii="Leelawad UI" w:cs="Leelawad UI" w:eastAsia="Leelawad UI" w:hAnsi="Leelawad UI"/>
+                <w:b w:val="false"/>
+                <w:bCs w:val="false"/>
+                <w:i w:val="false"/>
+                <w:iCs w:val="false"/>
+                <w:color w:val="111111"/>
+                <w:sz w:val="22"/>
+                <w:szCs w:val="22"/>
+              </w:rPr>
+              <w:t>เชิญหนูเก็บเข้ากลุ่มไลน์ → ไฟล์ที่สมาชิกส่งในกลุ่ม "หลังจากนั้น" ถูกเก็บเข้าพื้นที่กลางของกลุ่มอัตโนมัติ ผูกกลุ่มกับทีมในแดชบอร์ดได้ ("หนูเก็บผูกทีม") · ในกลุ่มหนูเก็บเก็บให้แบบเงียบ ๆ เสมอ — ไม่ตอบอะไรกลับเลย ไม่มีให้ตั้งค่า (เดิมมีคำสั่งเปิด/ปิดแจ้งเตือน ตอนนี้เลิกใช้แล้ว)</w:t>
             </w:r>
           </w:p>
         </w:tc>
         <w:tc>
           <w:tcPr>
             <w:tcW w:type="dxa" w:w="3426"/>
-            <w:tcMar>
-              <w:top w:type="dxa" w:w="60"/>
-              <w:left w:type="dxa" w:w="100"/>
-              <w:bottom w:type="dxa" w:w="60"/>
-              <w:right w:type="dxa" w:w="100"/>
-            </w:tcMar>
-          </w:tcPr>
-          <w:p>
-            <w:pPr>
-              <w:spacing w:after="40"/>
-            </w:pPr>
-            <w:r>
-              <w:rPr>
-                <w:rFonts w:ascii="Leelawad UI" w:cs="Leelawad UI" w:eastAsia="Leelawad UI" w:hAnsi="Leelawad UI"/>
-                <w:b w:val="false"/>
-                <w:bCs w:val="false"/>
-                <w:i w:val="false"/>
-                <w:iCs w:val="false"/>
-                <w:color w:val="111111"/>
-                <w:sz w:val="22"/>
-                <w:szCs w:val="22"/>
-              </w:rPr>
-              <w:t xml:space="preserve">"สร้างงานในกลุ่ม มอบหมายให้ใครก็ได้ หนูเก็บประกาศให้ทั้งกลุ่มเห็น กดเสร็จได้ในแชท เพิ่มลงปฏิทินได้" (ยังไม่เปิด: การเตือนอัตโนมัติก่อนถึงกำหนด — ห้ามเคลม ดูตาราง 2.3)</w:t>
+            <w:shd w:fill="FAFAFA" w:val="clear"/>
+            <w:tcMar>
+              <w:top w:type="dxa" w:w="60"/>
+              <w:left w:type="dxa" w:w="100"/>
+              <w:bottom w:type="dxa" w:w="60"/>
+              <w:right w:type="dxa" w:w="100"/>
+            </w:tcMar>
+          </w:tcPr>
+          <w:p>
+            <w:pPr>
+              <w:spacing w:after="40"/>
+            </w:pPr>
+            <w:r>
+              <w:rPr>
+                <w:rFonts w:ascii="Leelawad UI" w:cs="Leelawad UI" w:eastAsia="Leelawad UI" w:hAnsi="Leelawad UI"/>
+                <w:b w:val="false"/>
+                <w:bCs w:val="false"/>
+                <w:i w:val="false"/>
+                <w:iCs w:val="false"/>
+                <w:color w:val="111111"/>
+                <w:sz w:val="22"/>
+                <w:szCs w:val="22"/>
+              </w:rPr>
+              <w:t>"ดึงหนูเก็บเข้ากลุ่ม แล้วไฟล์ของทั้งกลุ่มจะไม่หายอีกเลย — ใครส่งอะไร เก็บให้หมด แบบเงียบ ๆ ไม่รบกวนแชท"</w:t>
+            </w:r>
+          </w:p>
+        </w:tc>
+      </w:tr>
+      <w:tr>
+        <w:tc>
+          <w:tcPr>
+            <w:tcW w:type="dxa" w:w="2100"/>
+            <w:tcMar>
+              <w:top w:type="dxa" w:w="60"/>
+              <w:left w:type="dxa" w:w="100"/>
+              <w:bottom w:type="dxa" w:w="60"/>
+              <w:right w:type="dxa" w:w="100"/>
+            </w:tcMar>
+          </w:tcPr>
+          <w:p>
+            <w:pPr>
+              <w:spacing w:after="40"/>
+            </w:pPr>
+            <w:r>
+              <w:rPr>
+                <w:rFonts w:ascii="Leelawad UI" w:cs="Leelawad UI" w:eastAsia="Leelawad UI" w:hAnsi="Leelawad UI"/>
+                <w:b w:val="false"/>
+                <w:bCs w:val="false"/>
+                <w:i w:val="false"/>
+                <w:iCs w:val="false"/>
+                <w:color w:val="111111"/>
+                <w:sz w:val="22"/>
+                <w:szCs w:val="22"/>
+              </w:rPr>
+              <w:t>ตามงาน (Task) — ในกลุ่ม &amp; งานส่วนตัว</w:t>
+            </w:r>
+          </w:p>
+        </w:tc>
+        <w:tc>
+          <w:tcPr>
+            <w:tcW w:type="dxa" w:w="3500"/>
+            <w:tcMar>
+              <w:top w:type="dxa" w:w="60"/>
+              <w:left w:type="dxa" w:w="100"/>
+              <w:bottom w:type="dxa" w:w="60"/>
+              <w:right w:type="dxa" w:w="100"/>
+            </w:tcMar>
+          </w:tcPr>
+          <w:p>
+            <w:pPr>
+              <w:spacing w:after="40"/>
+            </w:pPr>
+            <w:r>
+              <w:rPr>
+                <w:rFonts w:ascii="Leelawad UI" w:cs="Leelawad UI" w:eastAsia="Leelawad UI" w:hAnsi="Leelawad UI"/>
+                <w:b w:val="false"/>
+                <w:bCs w:val="false"/>
+                <w:i w:val="false"/>
+                <w:iCs w:val="false"/>
+                <w:color w:val="111111"/>
+                <w:sz w:val="22"/>
+                <w:szCs w:val="22"/>
+              </w:rPr>
+              <w:t>พิมพ์ "หนูเก็บสร้างงาน" · ในกลุ่ม → ได้การ์ด "ห้องทีม" (ปุ่มเปิดห้องทีม + สร้างงานใหม่) · ในแชทส่วนตัว → ได้การ์ดสร้าง "งานส่วนตัว" ที่มีแค่พี่คนเดียว → กดเปิดหน้าเว็บ LIFF แล้วเลือกแบบงาน: "งานเดียว มอบหลายคน" / "แยกงานเป็นรายการ" (แยกผู้รับผิดชอบ+กำหนดส่งรายข้อ) / "งานประจำ" (ทำซ้ำตามรอบ) → ในกลุ่มหนูเก็บโพสต์การ์ดประกาศงานเข้ากลุ่ม กดปุ่ม "รับงาน/เสร็จแล้ว" ได้ในแชท · แนบไฟล์/ลิงก์ประกอบงานได้ (5 ไฟล์/ครั้ง ไฟล์ละ ≤20 MB สูงสุด 30 ไฟล์ต่องาน · ลิงก์ 20 ลิงก์ต่องาน) · ผู้รับงาน "ส่งงานกลับ" ได้ แล้วคนสั่งกด "รับงาน" หรือ "ตีกลับ" พร้อมเหตุผล · ดูงานทั้งหมดได้ที่ห้องทีม (LIFF) และแดชบอร์ดเว็บ /dashboard/tasks · โหลดไฟล์ปฏิทิน (.ics) เข้าปฏิทินมือถือได้ · ดาวน์โหลดสรุปงานเป็นไฟล์ Excel (.xlsx) ได้ฟรี</w:t>
+            </w:r>
+          </w:p>
+        </w:tc>
+        <w:tc>
+          <w:tcPr>
+            <w:tcW w:type="dxa" w:w="3426"/>
+            <w:tcMar>
+              <w:top w:type="dxa" w:w="60"/>
+              <w:left w:type="dxa" w:w="100"/>
+              <w:bottom w:type="dxa" w:w="60"/>
+              <w:right w:type="dxa" w:w="100"/>
+            </w:tcMar>
+          </w:tcPr>
+          <w:p>
+            <w:pPr>
+              <w:spacing w:after="40"/>
+            </w:pPr>
+            <w:r>
+              <w:rPr>
+                <w:rFonts w:ascii="Leelawad UI" w:cs="Leelawad UI" w:eastAsia="Leelawad UI" w:hAnsi="Leelawad UI"/>
+                <w:b w:val="false"/>
+                <w:bCs w:val="false"/>
+                <w:i w:val="false"/>
+                <w:iCs w:val="false"/>
+                <w:color w:val="111111"/>
+                <w:sz w:val="22"/>
+                <w:szCs w:val="22"/>
+              </w:rPr>
+              <w:t>"สร้างงานในกลุ่ม มอบหมายให้ใครก็ได้ หนูเก็บประกาศให้ทั้งกลุ่มเห็น กดเสร็จได้ในแชท แนบไฟล์งานได้ ส่งงานกลับให้คนสั่งตรวจได้ เพิ่มลงปฏิทินได้ และดาวน์โหลดสรุปเป็น Excel ได้" · "อยู่คนเดียวก็ใช้ได้ — พิมพ์ หนูเก็บสร้างงาน ในแชทส่วนตัว ได้งานส่วนตัวเลย" (ยังไม่เปิด: การเตือนอัตโนมัติก่อนถึงกำหนด — ห้ามเคลม ดูตาราง 2.3)</w:t>
             </w:r>
           </w:p>
         </w:tc>
@@ -5949,7 +5856,7 @@
                 <w:sz w:val="22"/>
                 <w:szCs w:val="22"/>
               </w:rPr>
-              <w:t xml:space="preserve">"สแกน/แปลงไฟล์/ไดอารี่ ใช้ในกลุ่มได้"</w:t>
+              <w:t>"สแกน / รวมรูป / รวมไฟล์ PDF / แปลงไฟล์ / ไดอารี่ ใช้ในกลุ่มได้"</w:t>
             </w:r>
           </w:p>
         </w:tc>
@@ -5979,7 +5886,7 @@
                 <w:sz w:val="22"/>
                 <w:szCs w:val="22"/>
               </w:rPr>
-              <w:t xml:space="preserve">3 ฟีเจอร์นี้ใช้ได้เฉพาะแชทส่วนตัวกับหนูเก็บ</w:t>
+              <w:t>5 ฟีเจอร์นี้ใช้ได้เฉพาะแชทส่วนตัวกับหนูเก็บ (ในกลุ่มหนูเก็บจะตอบให้ไปทักในแชทส่วนตัว)</w:t>
             </w:r>
           </w:p>
         </w:tc>
@@ -6191,6 +6098,273 @@
                 <w:szCs w:val="22"/>
               </w:rPr>
               <w:t xml:space="preserve">พูดจากประสบการณ์จริง: "เปิดมาอีกทีก็หมดอายุแล้ว" (ทุกคนเคยเจอ ไม่ต้องอ้างตัวเลข)</w:t>
+            </w:r>
+          </w:p>
+        </w:tc>
+      </w:tr>
+      <w:tr>
+        <w:tc>
+          <w:tcPr>
+            <w:tcW w:type="dxa" w:w="2800"/>
+            <w:tcMar>
+              <w:top w:type="dxa" w:w="60"/>
+              <w:left w:type="dxa" w:w="100"/>
+              <w:bottom w:type="dxa" w:w="60"/>
+              <w:right w:type="dxa" w:w="100"/>
+            </w:tcMar>
+          </w:tcPr>
+          <w:p>
+            <w:pPr>
+              <w:spacing w:after="40"/>
+            </w:pPr>
+            <w:r>
+              <w:rPr>
+                <w:rFonts w:ascii="Leelawad UI" w:cs="Leelawad UI" w:eastAsia="Leelawad UI" w:hAnsi="Leelawad UI"/>
+                <w:b w:val="false"/>
+                <w:bCs w:val="false"/>
+                <w:i w:val="false"/>
+                <w:iCs w:val="false"/>
+                <w:color w:val="111111"/>
+                <w:sz w:val="22"/>
+                <w:szCs w:val="22"/>
+              </w:rPr>
+              <w:t>"ตั้งค่าให้หนูเก็บตอบทุกครั้งที่เก็บไฟล์ในกลุ่มได้" / สอนคำสั่ง "หนูเก็บปิด–เปิดแจ้งเตือน"</w:t>
+            </w:r>
+          </w:p>
+        </w:tc>
+        <w:tc>
+          <w:tcPr>
+            <w:tcW w:type="dxa" w:w="3100"/>
+            <w:tcMar>
+              <w:top w:type="dxa" w:w="60"/>
+              <w:left w:type="dxa" w:w="100"/>
+              <w:bottom w:type="dxa" w:w="60"/>
+              <w:right w:type="dxa" w:w="100"/>
+            </w:tcMar>
+          </w:tcPr>
+          <w:p>
+            <w:pPr>
+              <w:spacing w:after="40"/>
+            </w:pPr>
+            <w:r>
+              <w:rPr>
+                <w:rFonts w:ascii="Leelawad UI" w:cs="Leelawad UI" w:eastAsia="Leelawad UI" w:hAnsi="Leelawad UI"/>
+                <w:b w:val="false"/>
+                <w:bCs w:val="false"/>
+                <w:i w:val="false"/>
+                <w:iCs w:val="false"/>
+                <w:color w:val="111111"/>
+                <w:sz w:val="22"/>
+                <w:szCs w:val="22"/>
+              </w:rPr>
+              <w:t>คำสั่งเปิด/ปิดแจ้งเตือนในกลุ่มถูกยกเลิกไปแล้ว — ตอนนี้กลุ่มเก็บไฟล์แบบเงียบเสมอ ไม่มีการตอบกลับและตั้งค่าไม่ได้</w:t>
+            </w:r>
+          </w:p>
+        </w:tc>
+        <w:tc>
+          <w:tcPr>
+            <w:tcW w:type="dxa" w:w="3126"/>
+            <w:tcMar>
+              <w:top w:type="dxa" w:w="60"/>
+              <w:left w:type="dxa" w:w="100"/>
+              <w:bottom w:type="dxa" w:w="60"/>
+              <w:right w:type="dxa" w:w="100"/>
+            </w:tcMar>
+          </w:tcPr>
+          <w:p>
+            <w:pPr>
+              <w:spacing w:after="40"/>
+            </w:pPr>
+            <w:r>
+              <w:rPr>
+                <w:rFonts w:ascii="Leelawad UI" w:cs="Leelawad UI" w:eastAsia="Leelawad UI" w:hAnsi="Leelawad UI"/>
+                <w:b w:val="false"/>
+                <w:bCs w:val="false"/>
+                <w:i w:val="false"/>
+                <w:iCs w:val="false"/>
+                <w:color w:val="111111"/>
+                <w:sz w:val="22"/>
+                <w:szCs w:val="22"/>
+              </w:rPr>
+              <w:t>"ในกลุ่มหนูเก็บเก็บให้เงียบ ๆ ไม่เด้งกวนแชท เข้าไปดูไฟล์ทั้งหมดได้ในล็อคเกอร์ของกลุ่ม"</w:t>
+            </w:r>
+          </w:p>
+        </w:tc>
+      </w:tr>
+      <w:tr>
+        <w:tc>
+          <w:tcPr>
+            <w:tcW w:type="dxa" w:w="2800"/>
+            <w:tcMar>
+              <w:top w:type="dxa" w:w="60"/>
+              <w:left w:type="dxa" w:w="100"/>
+              <w:bottom w:type="dxa" w:w="60"/>
+              <w:right w:type="dxa" w:w="100"/>
+            </w:tcMar>
+          </w:tcPr>
+          <w:p>
+            <w:pPr>
+              <w:spacing w:after="40"/>
+            </w:pPr>
+            <w:r>
+              <w:rPr>
+                <w:rFonts w:ascii="Leelawad UI" w:cs="Leelawad UI" w:eastAsia="Leelawad UI" w:hAnsi="Leelawad UI"/>
+                <w:b w:val="false"/>
+                <w:bCs w:val="false"/>
+                <w:i w:val="false"/>
+                <w:iCs w:val="false"/>
+                <w:color w:val="111111"/>
+                <w:sz w:val="22"/>
+                <w:szCs w:val="22"/>
+              </w:rPr>
+              <w:t>"ต่อ Google Sheets ให้งานอัปเดตอัตโนมัติได้เลย"</w:t>
+            </w:r>
+          </w:p>
+        </w:tc>
+        <w:tc>
+          <w:tcPr>
+            <w:tcW w:type="dxa" w:w="3100"/>
+            <w:tcMar>
+              <w:top w:type="dxa" w:w="60"/>
+              <w:left w:type="dxa" w:w="100"/>
+              <w:bottom w:type="dxa" w:w="60"/>
+              <w:right w:type="dxa" w:w="100"/>
+            </w:tcMar>
+          </w:tcPr>
+          <w:p>
+            <w:pPr>
+              <w:spacing w:after="40"/>
+            </w:pPr>
+            <w:r>
+              <w:rPr>
+                <w:rFonts w:ascii="Leelawad UI" w:cs="Leelawad UI" w:eastAsia="Leelawad UI" w:hAnsi="Leelawad UI"/>
+                <w:b w:val="false"/>
+                <w:bCs w:val="false"/>
+                <w:i w:val="false"/>
+                <w:iCs w:val="false"/>
+                <w:color w:val="111111"/>
+                <w:sz w:val="22"/>
+                <w:szCs w:val="22"/>
+              </w:rPr>
+              <w:t>การซิงก์ Google Sheets ถูกล็อกไว้ในแผน Pro ซึ่งยังไม่เปิดขาย (ผู้ใช้ฟรีกดแล้วเจอหน้า "เร็ว ๆ นี้") — เคลมแล้วคนกดตามไม่ได้จริง</w:t>
+            </w:r>
+          </w:p>
+        </w:tc>
+        <w:tc>
+          <w:tcPr>
+            <w:tcW w:type="dxa" w:w="3126"/>
+            <w:tcMar>
+              <w:top w:type="dxa" w:w="60"/>
+              <w:left w:type="dxa" w:w="100"/>
+              <w:bottom w:type="dxa" w:w="60"/>
+              <w:right w:type="dxa" w:w="100"/>
+            </w:tcMar>
+          </w:tcPr>
+          <w:p>
+            <w:pPr>
+              <w:spacing w:after="40"/>
+            </w:pPr>
+            <w:r>
+              <w:rPr>
+                <w:rFonts w:ascii="Leelawad UI" w:cs="Leelawad UI" w:eastAsia="Leelawad UI" w:hAnsi="Leelawad UI"/>
+                <w:b w:val="false"/>
+                <w:bCs w:val="false"/>
+                <w:i w:val="false"/>
+                <w:iCs w:val="false"/>
+                <w:color w:val="111111"/>
+                <w:sz w:val="22"/>
+                <w:szCs w:val="22"/>
+              </w:rPr>
+              <w:t>ไม่พูดถึงจนกว่าจะเปิด · ถ้าต้องพูดเรื่องส่งออกงาน ให้พูดถึง "ดาวน์โหลดสรุปงานเป็นไฟล์ Excel" ซึ่งใช้ได้จริงและฟรี</w:t>
+            </w:r>
+          </w:p>
+        </w:tc>
+      </w:tr>
+      <w:tr>
+        <w:tc>
+          <w:tcPr>
+            <w:tcW w:type="dxa" w:w="2800"/>
+            <w:tcMar>
+              <w:top w:type="dxa" w:w="60"/>
+              <w:left w:type="dxa" w:w="100"/>
+              <w:bottom w:type="dxa" w:w="60"/>
+              <w:right w:type="dxa" w:w="100"/>
+            </w:tcMar>
+          </w:tcPr>
+          <w:p>
+            <w:pPr>
+              <w:spacing w:after="40"/>
+            </w:pPr>
+            <w:r>
+              <w:rPr>
+                <w:rFonts w:ascii="Leelawad UI" w:cs="Leelawad UI" w:eastAsia="Leelawad UI" w:hAnsi="Leelawad UI"/>
+                <w:b w:val="false"/>
+                <w:bCs w:val="false"/>
+                <w:i w:val="false"/>
+                <w:iCs w:val="false"/>
+                <w:color w:val="111111"/>
+                <w:sz w:val="22"/>
+                <w:szCs w:val="22"/>
+              </w:rPr>
+              <w:t>"งานส่วนตัวจะเตือนในแชทให้เอง"</w:t>
+            </w:r>
+          </w:p>
+        </w:tc>
+        <w:tc>
+          <w:tcPr>
+            <w:tcW w:type="dxa" w:w="3100"/>
+            <w:tcMar>
+              <w:top w:type="dxa" w:w="60"/>
+              <w:left w:type="dxa" w:w="100"/>
+              <w:bottom w:type="dxa" w:w="60"/>
+              <w:right w:type="dxa" w:w="100"/>
+            </w:tcMar>
+          </w:tcPr>
+          <w:p>
+            <w:pPr>
+              <w:spacing w:after="40"/>
+            </w:pPr>
+            <w:r>
+              <w:rPr>
+                <w:rFonts w:ascii="Leelawad UI" w:cs="Leelawad UI" w:eastAsia="Leelawad UI" w:hAnsi="Leelawad UI"/>
+                <w:b w:val="false"/>
+                <w:bCs w:val="false"/>
+                <w:i w:val="false"/>
+                <w:iCs w:val="false"/>
+                <w:color w:val="111111"/>
+                <w:sz w:val="22"/>
+                <w:szCs w:val="22"/>
+              </w:rPr>
+              <w:t>งานส่วนตัวสร้างได้จริง แต่การเตือนอัตโนมัติปิดอยู่ทั้งระบบ (ทั้งงานกลุ่มและงานส่วนตัว) เหมือนกัน</w:t>
+            </w:r>
+          </w:p>
+        </w:tc>
+        <w:tc>
+          <w:tcPr>
+            <w:tcW w:type="dxa" w:w="3126"/>
+            <w:tcMar>
+              <w:top w:type="dxa" w:w="60"/>
+              <w:left w:type="dxa" w:w="100"/>
+              <w:bottom w:type="dxa" w:w="60"/>
+              <w:right w:type="dxa" w:w="100"/>
+            </w:tcMar>
+          </w:tcPr>
+          <w:p>
+            <w:pPr>
+              <w:spacing w:after="40"/>
+            </w:pPr>
+            <w:r>
+              <w:rPr>
+                <w:rFonts w:ascii="Leelawad UI" w:cs="Leelawad UI" w:eastAsia="Leelawad UI" w:hAnsi="Leelawad UI"/>
+                <w:b w:val="false"/>
+                <w:bCs w:val="false"/>
+                <w:i w:val="false"/>
+                <w:iCs w:val="false"/>
+                <w:color w:val="111111"/>
+                <w:sz w:val="22"/>
+                <w:szCs w:val="22"/>
+              </w:rPr>
+              <w:t>"จดงานส่วนตัวไว้กับหนูเก็บ เปิดดูได้ทั้งในไลน์และบนเว็บ"</w:t>
             </w:r>
           </w:p>
         </w:tc>
@@ -9547,7 +9721,7 @@
           <w:sz w:val="22"/>
           <w:szCs w:val="22"/>
         </w:rPr>
-        <w:t xml:space="preserve">• "รับของจากพี่แล้วน้า — หนูกำลังเก็บอยู่น้า 0/3 ชิ้น" (การ์ดตอนรับไฟล์)</w:t>
+        <w:t>• "รอสักครู่น้า หนูกำลังทำงานอยู่เลย / รับของจากพี่ [ชื่อ] แล้วน้า / หนูกำลังเก็บอยู่น้า 0/3 ชิ้น" (การ์ดตอนรับไฟล์ในแชทส่วนตัว)</w:t>
       </w:r>
     </w:p>
     <w:p>
@@ -9593,7 +9767,7 @@
           <w:sz w:val="22"/>
           <w:szCs w:val="22"/>
         </w:rPr>
-        <w:t xml:space="preserve">• "ส่งรูปหรือไฟล์เข้ามาในแชทนี้ได้เลยน้า เดี๋ยวหนูเก็บให้เองน้า" (ชวนอัพโหลด)</w:t>
+        <w:t>• "ส่งรูปหรือไฟล์เข้ามาในแชทได้เลยน้า เดี๋ยวหนูเก็บให้พี่เอง" (ชวนอัพโหลด)</w:t>
       </w:r>
     </w:p>
     <w:p>
@@ -9616,7 +9790,7 @@
           <w:sz w:val="22"/>
           <w:szCs w:val="22"/>
         </w:rPr>
-        <w:t xml:space="preserve">• "ปิดการแจ้งเตือนแล้วน้า — ต่อไปหนูจะเก็บของเงียบๆ ให้น้า 🤫" (โหมดเงียบในกลุ่ม)</w:t>
+        <w:t>• "ทุกอย่างที่พี่อยากเก็บ ฝากหนูได้เลยน้า 📁✨" (หนูเก็บแนะนำตัว)</w:t>
       </w:r>
     </w:p>
     <w:p>
@@ -9639,7 +9813,7 @@
           <w:sz w:val="22"/>
           <w:szCs w:val="22"/>
         </w:rPr>
-        <w:t xml:space="preserve">• "จดข้อความไว้แล้วน้า ส่งรูปมาได้เลย 🌸" (ไดอารี่ — รับแคปชั่นแล้ว)</w:t>
+        <w:t>• "จดข้อความไว้ให้แล้วน้า ส่งรูปมาได้เลยน้า 🌸" (ไดอารี่ — รับแคปชั่นแล้ว)</w:t>
       </w:r>
     </w:p>
     <w:p>
@@ -9662,7 +9836,7 @@
           <w:sz w:val="22"/>
           <w:szCs w:val="22"/>
         </w:rPr>
-        <w:t xml:space="preserve">• "บันทึกวันนี้แล้วนะ 🌸 มาพรุ่งนี้อีกครั้งได้เลย" (ไดอารี่ — วันนี้บันทึกไปแล้ว)</w:t>
+        <w:t>• "วันนี้พี่บันทึกไว้แล้วน้า 🌸 พรุ่งนี้มาทำต่อได้เลยน้า" (ไดอารี่ — วันนี้บันทึกไปแล้ว)</w:t>
       </w:r>
     </w:p>
     <w:p>
@@ -9685,7 +9859,7 @@
           <w:sz w:val="22"/>
           <w:szCs w:val="22"/>
         </w:rPr>
-        <w:t xml:space="preserve">• "ขาดอีกคนเดียวได้ 4 GB เต็มแล้วววว 🔥" (เชียร์ตอนชวนเพื่อนใกล้ครบขั้นสูงสุด — ตัวเลขปรับตามระบบจริง 1/2.5/4 GB)</w:t>
+        <w:t>• "อีกคนเดียว! ได้ 4 GB เลยยย 💪" (เชียร์ตอนชวนเพื่อนใกล้ครบขั้นสูงสุด — ตัวเลขตามระบบจริง 1/2.5/4 GB)</w:t>
       </w:r>
     </w:p>
     <w:p>
@@ -9708,7 +9882,7 @@
           <w:sz w:val="22"/>
           <w:szCs w:val="22"/>
         </w:rPr>
-        <w:t xml:space="preserve">• "เก่งมากๆ เลยนะ! ⭐ ครบ 5 คนแย้ว ได้ 4 GB เต็ม ๆ 🌟" (ฉลอง milestone)</w:t>
+        <w:t>• "หนูเก็บ: ทำได้สุดยอดมากเลย! 👑 / 5 คนแย้วสุดเจ๋ง 🏆 ได้ 4 GB เต็มๆ แล้ว!" (ฉลอง milestone ขั้นสูงสุด)</w:t>
       </w:r>
     </w:p>
     <w:p>
@@ -9731,7 +9905,7 @@
           <w:sz w:val="22"/>
           <w:szCs w:val="22"/>
         </w:rPr>
-        <w:t xml:space="preserve">• "ไฟล์ใหญ่เกิน 10MB น้า ระบบแปลงไฟล์รับได้แค่นี้ก่อน ลองย่อไฟล์หรือแบ่งส่งน้า" (แจ้งข้อจำกัด — บอกลิมิต + ทางแก้ ไม่โทษผู้ใช้)</w:t>
+        <w:t>• "ไฟล์ใหญ่เกิน 10MB น้า ระบบแปลงไฟล์รับได้เท่านี้ก่อนน้า ลองย่อไฟล์หรือแบ่งส่งมาใหม่ได้เลยน้า" (แจ้งข้อจำกัด — บอกลิมิต + ทางแก้ ไม่โทษผู้ใช้)</w:t>
       </w:r>
     </w:p>
     <w:p>
@@ -9754,7 +9928,7 @@
           <w:sz w:val="22"/>
           <w:szCs w:val="22"/>
         </w:rPr>
-        <w:t xml:space="preserve">• "หนูไม่เข้าใจคำสั่งนี้น้า พิมพ์ ‘หนูเก็บคำสั่ง’ เพื่อดูคำสั่งทั้งหมดได้เลยน้า" (ไม่เข้าใจ — ชี้ทางต่อเสมอ)</w:t>
+        <w:t>• "หนูไม่เข้าใจคำสั่งนี้น้า พิมพ์ "หนูเก็บคำสั่ง" เพื่อดูคำสั่งทั้งหมดได้เลยน้า 💬" (ไม่เข้าใจ — ชี้ทางต่อเสมอ)</w:t>
       </w:r>
     </w:p>
     <w:p>
@@ -21102,7 +21276,7 @@
           <w:sz w:val="22"/>
           <w:szCs w:val="22"/>
         </w:rPr>
-        <w:t xml:space="preserve">ฮุกชุดนี้ผูกกับฟีเจอร์ที่เพิ่งเปิด ตรวจกับตาราง 2.2/2.3 แล้ว — โดยเฉพาะ "ตามงาน" ห้ามเคลมการเตือนอัตโนมัติ (ยังปิดอยู่) และ "ห้องนิรภัย" ต้องย้ำว่ารีเซ็ต PIN ไม่ได้</w:t>
+        <w:t>ฮุกชุดนี้ผูกกับฟีเจอร์ที่เพิ่งเปิด ตรวจกับตาราง 2.2/2.3 แล้ว — โดยเฉพาะ "ตามงาน" ห้ามเคลมการเตือนอัตโนมัติ (ยังปิดอยู่ทั้งงานกลุ่มและงานส่วนตัว) และห้ามเคลมการต่อ Google Sheets (ล็อกไว้ในแผน Pro ที่ยังไม่เปิด) · "ห้องนิรภัย" ต้องย้ำว่ารีเซ็ต PIN ไม่ได้ · ถ้าเล่าเรื่องตามงานในแชทเดี่ยว ให้เรียกว่า "งานส่วนตัว" และเข้าด้วยคำสั่ง "หนูเก็บสร้างงาน" เหมือนกัน</w:t>
       </w:r>
     </w:p>
     <w:tbl>
@@ -28742,20 +28916,7 @@
           <w:sz w:val="22"/>
           <w:szCs w:val="22"/>
         </w:rPr>
-        <w:t xml:space="preserve">2.</w:t>
-      </w:r>
-      <w:r>
-        <w:rPr>
-          <w:rFonts w:ascii="Leelawad UI" w:cs="Leelawad UI" w:eastAsia="Leelawad UI" w:hAnsi="Leelawad UI"/>
-          <w:b w:val="false"/>
-          <w:bCs w:val="false"/>
-          <w:i w:val="false"/>
-          <w:iCs w:val="false"/>
-          <w:color w:val="111111"/>
-          <w:sz w:val="22"/>
-          <w:szCs w:val="22"/>
-        </w:rPr>
-        <w:t xml:space="preserve"> ตัวเลขถูกต้อง: ฟรี 1 GB · โค้ด +0.5 GB · ชวน 3 คน = 2.5 GB / 5 คน = 4 GB (สูงสุด) · ไฟล์ ≤ 1 GB · ห้องนิรภัย ≤ 100 MB/ไฟล์ · แปลง Word ≤ 10 MB · ไดอารี่วันละ 1 รูป ≤ 10 MB · กล่องของขวัญ 1–10 รูป + เสียง ≤ 5 MB</w:t>
+        <w:t>2. ตัวเลขถูกต้อง: ฟรี 1 GB · โค้ด +0.5 GB · ชวน 3 คน = 2.5 GB / 5 คน = 4 GB (สูงสุด) · ไฟล์ ≤ 1 GB · ห้องนิรภัย ≤ 100 MB/ไฟล์ · แปลง Word ≤ 10 MB · ไดอารี่วันละ 1 รูป ≤ 10 MB · รวมไฟล์ PDF ≤ 20 MB/ไฟล์ สูงสุด 20 ไฟล์ · กล่องของขวัญ 1–10 รูป + เสียง ≤ 5 MB · แนบไฟล์ในงาน ≤ 20 MB/ไฟล์ สูงสุด 30 ไฟล์/งาน</w:t>
       </w:r>
     </w:p>
     <w:p>
@@ -28778,20 +28939,7 @@
           <w:sz w:val="22"/>
           <w:szCs w:val="22"/>
         </w:rPr>
-        <w:t xml:space="preserve">3.</w:t>
-      </w:r>
-      <w:r>
-        <w:rPr>
-          <w:rFonts w:ascii="Leelawad UI" w:cs="Leelawad UI" w:eastAsia="Leelawad UI" w:hAnsi="Leelawad UI"/>
-          <w:b w:val="false"/>
-          <w:bCs w:val="false"/>
-          <w:i w:val="false"/>
-          <w:iCs w:val="false"/>
-          <w:color w:val="111111"/>
-          <w:sz w:val="22"/>
-          <w:szCs w:val="22"/>
-        </w:rPr>
-        <w:t xml:space="preserve"> ฟีเจอร์ใหม่พูดตรงระบบ: "ตามงาน" ยังไม่เตือนอัตโนมัติ (ห้ามเคลม) · ห้องนิรภัยรีเซ็ต PIN ไม่ได้ · ไม่เคลม "เก็บถาวรตลอดไป" แบบไม่มีเงื่อนไข (มีถังขยะ/รอบล้าง)</w:t>
+        <w:t>3. ฟีเจอร์ใหม่พูดตรงระบบ: "ตามงาน" ยังไม่เตือนอัตโนมัติ (ห้ามเคลม ทั้งงานกลุ่มและงานส่วนตัว) · เข้าใช้ด้วยคำสั่ง "หนูเก็บสร้างงาน" (ในกลุ่ม = การ์ดห้องทีม / ในแชทเดี่ยว = งานส่วนตัว) · แนบไฟล์+ส่งงานกลับ+ตีกลับ พูดได้ · Google Sheets ห้ามเคลม (ล็อกในแผน Pro) · ห้องนิรภัยรีเซ็ต PIN ไม่ได้ · ไม่เคลม "เก็บถาวรตลอดไป" แบบไม่มีเงื่อนไข (มีถังขยะ/รอบล้าง)</w:t>
       </w:r>
     </w:p>
     <w:p>
@@ -29066,20 +29214,7 @@
           <w:sz w:val="22"/>
           <w:szCs w:val="22"/>
         </w:rPr>
-        <w:t xml:space="preserve">11.</w:t>
-      </w:r>
-      <w:r>
-        <w:rPr>
-          <w:rFonts w:ascii="Leelawad UI" w:cs="Leelawad UI" w:eastAsia="Leelawad UI" w:hAnsi="Leelawad UI"/>
-          <w:b w:val="false"/>
-          <w:bCs w:val="false"/>
-          <w:i w:val="false"/>
-          <w:iCs w:val="false"/>
-          <w:color w:val="111111"/>
-          <w:sz w:val="22"/>
-          <w:szCs w:val="22"/>
-        </w:rPr>
-        <w:t xml:space="preserve"> ฟีเจอร์เฉพาะแชทส่วนตัว (สแกน/แปลงไฟล์/ไดอารี่) ไม่ถูกเล่าว่าใช้ในกลุ่มได้</w:t>
+        <w:t>11. ฟีเจอร์เฉพาะแชทส่วนตัว (สแกน/รวมรูป/รวมไฟล์ PDF/แปลงไฟล์/ไดอารี่) ไม่ถูกเล่าว่าใช้ในกลุ่มได้ · และไม่เล่าว่าตั้งค่าให้หนูเก็บตอบในกลุ่มได้ (กลุ่มเก็บเงียบเสมอ)</w:t>
       </w:r>
     </w:p>
     <w:p>
@@ -30397,58 +30532,60 @@
         <w:tc>
           <w:tcPr>
             <w:tcW w:type="dxa" w:w="5500"/>
-            <w:tcMar>
-              <w:top w:type="dxa" w:w="60"/>
-              <w:left w:type="dxa" w:w="100"/>
-              <w:bottom w:type="dxa" w:w="60"/>
-              <w:right w:type="dxa" w:w="100"/>
-            </w:tcMar>
-          </w:tcPr>
-          <w:p>
-            <w:pPr>
-              <w:spacing w:after="40"/>
-            </w:pPr>
-            <w:r>
-              <w:rPr>
-                <w:rFonts w:ascii="Leelawad UI" w:cs="Leelawad UI" w:eastAsia="Leelawad UI" w:hAnsi="Leelawad UI"/>
-                <w:b w:val="false"/>
-                <w:bCs w:val="false"/>
-                <w:i w:val="false"/>
-                <w:iCs w:val="false"/>
-                <w:color w:val="111111"/>
-                <w:sz w:val="22"/>
-                <w:szCs w:val="22"/>
-              </w:rPr>
-              <w:t xml:space="preserve">ไดอารี่ — รูปสูงสุดต่อวัน</w:t>
+            <w:shd w:fill="FAFAFA" w:val="clear"/>
+            <w:tcMar>
+              <w:top w:type="dxa" w:w="60"/>
+              <w:left w:type="dxa" w:w="100"/>
+              <w:bottom w:type="dxa" w:w="60"/>
+              <w:right w:type="dxa" w:w="100"/>
+            </w:tcMar>
+          </w:tcPr>
+          <w:p>
+            <w:pPr>
+              <w:spacing w:after="40"/>
+            </w:pPr>
+            <w:r>
+              <w:rPr>
+                <w:rFonts w:ascii="Leelawad UI" w:cs="Leelawad UI" w:eastAsia="Leelawad UI" w:hAnsi="Leelawad UI"/>
+                <w:b w:val="false"/>
+                <w:bCs w:val="false"/>
+                <w:i w:val="false"/>
+                <w:iCs w:val="false"/>
+                <w:color w:val="111111"/>
+                <w:sz w:val="22"/>
+                <w:szCs w:val="22"/>
+              </w:rPr>
+              <w:t>รวมไฟล์ PDF — ต่อครั้ง</w:t>
             </w:r>
           </w:p>
         </w:tc>
         <w:tc>
           <w:tcPr>
             <w:tcW w:type="dxa" w:w="3526"/>
-            <w:tcMar>
-              <w:top w:type="dxa" w:w="60"/>
-              <w:left w:type="dxa" w:w="100"/>
-              <w:bottom w:type="dxa" w:w="60"/>
-              <w:right w:type="dxa" w:w="100"/>
-            </w:tcMar>
-          </w:tcPr>
-          <w:p>
-            <w:pPr>
-              <w:spacing w:after="40"/>
-            </w:pPr>
-            <w:r>
-              <w:rPr>
-                <w:rFonts w:ascii="Leelawad UI" w:cs="Leelawad UI" w:eastAsia="Leelawad UI" w:hAnsi="Leelawad UI"/>
-                <w:b w:val="false"/>
-                <w:bCs w:val="false"/>
-                <w:i w:val="false"/>
-                <w:iCs w:val="false"/>
-                <w:color w:val="111111"/>
-                <w:sz w:val="22"/>
-                <w:szCs w:val="22"/>
-              </w:rPr>
-              <w:t xml:space="preserve">1 รูป / วัน · ไม่เกิน 10 MB (jpg, png, webp)</w:t>
+            <w:shd w:fill="FAFAFA" w:val="clear"/>
+            <w:tcMar>
+              <w:top w:type="dxa" w:w="60"/>
+              <w:left w:type="dxa" w:w="100"/>
+              <w:bottom w:type="dxa" w:w="60"/>
+              <w:right w:type="dxa" w:w="100"/>
+            </w:tcMar>
+          </w:tcPr>
+          <w:p>
+            <w:pPr>
+              <w:spacing w:after="40"/>
+            </w:pPr>
+            <w:r>
+              <w:rPr>
+                <w:rFonts w:ascii="Leelawad UI" w:cs="Leelawad UI" w:eastAsia="Leelawad UI" w:hAnsi="Leelawad UI"/>
+                <w:b w:val="false"/>
+                <w:bCs w:val="false"/>
+                <w:i w:val="false"/>
+                <w:iCs w:val="false"/>
+                <w:color w:val="111111"/>
+                <w:sz w:val="22"/>
+                <w:szCs w:val="22"/>
+              </w:rPr>
+              <w:t>ไฟล์ต้นทาง ≤ 20 MB/ไฟล์ · สูงสุด 20 ไฟล์ต่อการรวม 1 ครั้ง · รับเฉพาะไฟล์ .pdf · แชทส่วนตัวเท่านั้น</w:t>
             </w:r>
           </w:p>
         </w:tc>
@@ -30457,60 +30594,58 @@
         <w:tc>
           <w:tcPr>
             <w:tcW w:type="dxa" w:w="5500"/>
-            <w:shd w:fill="FAFAFA" w:val="clear"/>
-            <w:tcMar>
-              <w:top w:type="dxa" w:w="60"/>
-              <w:left w:type="dxa" w:w="100"/>
-              <w:bottom w:type="dxa" w:w="60"/>
-              <w:right w:type="dxa" w:w="100"/>
-            </w:tcMar>
-          </w:tcPr>
-          <w:p>
-            <w:pPr>
-              <w:spacing w:after="40"/>
-            </w:pPr>
-            <w:r>
-              <w:rPr>
-                <w:rFonts w:ascii="Leelawad UI" w:cs="Leelawad UI" w:eastAsia="Leelawad UI" w:hAnsi="Leelawad UI"/>
-                <w:b w:val="false"/>
-                <w:bCs w:val="false"/>
-                <w:i w:val="false"/>
-                <w:iCs w:val="false"/>
-                <w:color w:val="111111"/>
-                <w:sz w:val="22"/>
-                <w:szCs w:val="22"/>
-              </w:rPr>
-              <w:t xml:space="preserve">ห้องนิรภัย — ชนิด/ขนาดไฟล์</w:t>
+            <w:tcMar>
+              <w:top w:type="dxa" w:w="60"/>
+              <w:left w:type="dxa" w:w="100"/>
+              <w:bottom w:type="dxa" w:w="60"/>
+              <w:right w:type="dxa" w:w="100"/>
+            </w:tcMar>
+          </w:tcPr>
+          <w:p>
+            <w:pPr>
+              <w:spacing w:after="40"/>
+            </w:pPr>
+            <w:r>
+              <w:rPr>
+                <w:rFonts w:ascii="Leelawad UI" w:cs="Leelawad UI" w:eastAsia="Leelawad UI" w:hAnsi="Leelawad UI"/>
+                <w:b w:val="false"/>
+                <w:bCs w:val="false"/>
+                <w:i w:val="false"/>
+                <w:iCs w:val="false"/>
+                <w:color w:val="111111"/>
+                <w:sz w:val="22"/>
+                <w:szCs w:val="22"/>
+              </w:rPr>
+              <w:t xml:space="preserve">ไดอารี่ — รูปสูงสุดต่อวัน</w:t>
             </w:r>
           </w:p>
         </w:tc>
         <w:tc>
           <w:tcPr>
             <w:tcW w:type="dxa" w:w="3526"/>
-            <w:shd w:fill="FAFAFA" w:val="clear"/>
-            <w:tcMar>
-              <w:top w:type="dxa" w:w="60"/>
-              <w:left w:type="dxa" w:w="100"/>
-              <w:bottom w:type="dxa" w:w="60"/>
-              <w:right w:type="dxa" w:w="100"/>
-            </w:tcMar>
-          </w:tcPr>
-          <w:p>
-            <w:pPr>
-              <w:spacing w:after="40"/>
-            </w:pPr>
-            <w:r>
-              <w:rPr>
-                <w:rFonts w:ascii="Leelawad UI" w:cs="Leelawad UI" w:eastAsia="Leelawad UI" w:hAnsi="Leelawad UI"/>
-                <w:b w:val="false"/>
-                <w:bCs w:val="false"/>
-                <w:i w:val="false"/>
-                <w:iCs w:val="false"/>
-                <w:color w:val="111111"/>
-                <w:sz w:val="22"/>
-                <w:szCs w:val="22"/>
-              </w:rPr>
-              <w:t xml:space="preserve">รูป · วิดีโอ · PDF เท่านั้น · สูงสุด 100 MB/ไฟล์ · PIN 6 หลัก (ผิด 5 ครั้งล็อก 15 นาที) · รีเซ็ต PIN ไม่ได้</w:t>
+            <w:tcMar>
+              <w:top w:type="dxa" w:w="60"/>
+              <w:left w:type="dxa" w:w="100"/>
+              <w:bottom w:type="dxa" w:w="60"/>
+              <w:right w:type="dxa" w:w="100"/>
+            </w:tcMar>
+          </w:tcPr>
+          <w:p>
+            <w:pPr>
+              <w:spacing w:after="40"/>
+            </w:pPr>
+            <w:r>
+              <w:rPr>
+                <w:rFonts w:ascii="Leelawad UI" w:cs="Leelawad UI" w:eastAsia="Leelawad UI" w:hAnsi="Leelawad UI"/>
+                <w:b w:val="false"/>
+                <w:bCs w:val="false"/>
+                <w:i w:val="false"/>
+                <w:iCs w:val="false"/>
+                <w:color w:val="111111"/>
+                <w:sz w:val="22"/>
+                <w:szCs w:val="22"/>
+              </w:rPr>
+              <w:t xml:space="preserve">1 รูป / วัน · ไม่เกิน 10 MB (jpg, png, webp)</w:t>
             </w:r>
           </w:p>
         </w:tc>
@@ -30519,58 +30654,60 @@
         <w:tc>
           <w:tcPr>
             <w:tcW w:type="dxa" w:w="5500"/>
-            <w:tcMar>
-              <w:top w:type="dxa" w:w="60"/>
-              <w:left w:type="dxa" w:w="100"/>
-              <w:bottom w:type="dxa" w:w="60"/>
-              <w:right w:type="dxa" w:w="100"/>
-            </w:tcMar>
-          </w:tcPr>
-          <w:p>
-            <w:pPr>
-              <w:spacing w:after="40"/>
-            </w:pPr>
-            <w:r>
-              <w:rPr>
-                <w:rFonts w:ascii="Leelawad UI" w:cs="Leelawad UI" w:eastAsia="Leelawad UI" w:hAnsi="Leelawad UI"/>
-                <w:b w:val="false"/>
-                <w:bCs w:val="false"/>
-                <w:i w:val="false"/>
-                <w:iCs w:val="false"/>
-                <w:color w:val="111111"/>
-                <w:sz w:val="22"/>
-                <w:szCs w:val="22"/>
-              </w:rPr>
-              <w:t xml:space="preserve">กล่องของขวัญ — ต่อกล่อง</w:t>
+            <w:shd w:fill="FAFAFA" w:val="clear"/>
+            <w:tcMar>
+              <w:top w:type="dxa" w:w="60"/>
+              <w:left w:type="dxa" w:w="100"/>
+              <w:bottom w:type="dxa" w:w="60"/>
+              <w:right w:type="dxa" w:w="100"/>
+            </w:tcMar>
+          </w:tcPr>
+          <w:p>
+            <w:pPr>
+              <w:spacing w:after="40"/>
+            </w:pPr>
+            <w:r>
+              <w:rPr>
+                <w:rFonts w:ascii="Leelawad UI" w:cs="Leelawad UI" w:eastAsia="Leelawad UI" w:hAnsi="Leelawad UI"/>
+                <w:b w:val="false"/>
+                <w:bCs w:val="false"/>
+                <w:i w:val="false"/>
+                <w:iCs w:val="false"/>
+                <w:color w:val="111111"/>
+                <w:sz w:val="22"/>
+                <w:szCs w:val="22"/>
+              </w:rPr>
+              <w:t xml:space="preserve">ห้องนิรภัย — ชนิด/ขนาดไฟล์</w:t>
             </w:r>
           </w:p>
         </w:tc>
         <w:tc>
           <w:tcPr>
             <w:tcW w:type="dxa" w:w="3526"/>
-            <w:tcMar>
-              <w:top w:type="dxa" w:w="60"/>
-              <w:left w:type="dxa" w:w="100"/>
-              <w:bottom w:type="dxa" w:w="60"/>
-              <w:right w:type="dxa" w:w="100"/>
-            </w:tcMar>
-          </w:tcPr>
-          <w:p>
-            <w:pPr>
-              <w:spacing w:after="40"/>
-            </w:pPr>
-            <w:r>
-              <w:rPr>
-                <w:rFonts w:ascii="Leelawad UI" w:cs="Leelawad UI" w:eastAsia="Leelawad UI" w:hAnsi="Leelawad UI"/>
-                <w:b w:val="false"/>
-                <w:bCs w:val="false"/>
-                <w:i w:val="false"/>
-                <w:iCs w:val="false"/>
-                <w:color w:val="111111"/>
-                <w:sz w:val="22"/>
-                <w:szCs w:val="22"/>
-              </w:rPr>
-              <w:t xml:space="preserve">รูป 1–10 รูป (ต้นฉบับ ≤ 20 MB/รูป) · ข้อความ ≤ 500 ตัวอักษร · เสียงพูด (ไม่บังคับ) ≤ 5 MB ~60 วิ · สร้างพร้อมกันได้สูงสุด 10 กล่อง</w:t>
+            <w:shd w:fill="FAFAFA" w:val="clear"/>
+            <w:tcMar>
+              <w:top w:type="dxa" w:w="60"/>
+              <w:left w:type="dxa" w:w="100"/>
+              <w:bottom w:type="dxa" w:w="60"/>
+              <w:right w:type="dxa" w:w="100"/>
+            </w:tcMar>
+          </w:tcPr>
+          <w:p>
+            <w:pPr>
+              <w:spacing w:after="40"/>
+            </w:pPr>
+            <w:r>
+              <w:rPr>
+                <w:rFonts w:ascii="Leelawad UI" w:cs="Leelawad UI" w:eastAsia="Leelawad UI" w:hAnsi="Leelawad UI"/>
+                <w:b w:val="false"/>
+                <w:bCs w:val="false"/>
+                <w:i w:val="false"/>
+                <w:iCs w:val="false"/>
+                <w:color w:val="111111"/>
+                <w:sz w:val="22"/>
+                <w:szCs w:val="22"/>
+              </w:rPr>
+              <w:t xml:space="preserve">รูป · วิดีโอ · PDF เท่านั้น · สูงสุด 100 MB/ไฟล์ · PIN 6 หลัก (ผิด 5 ครั้งล็อก 15 นาที) · รีเซ็ต PIN ไม่ได้</w:t>
             </w:r>
           </w:p>
         </w:tc>
@@ -30579,60 +30716,58 @@
         <w:tc>
           <w:tcPr>
             <w:tcW w:type="dxa" w:w="5500"/>
-            <w:shd w:fill="FAFAFA" w:val="clear"/>
-            <w:tcMar>
-              <w:top w:type="dxa" w:w="60"/>
-              <w:left w:type="dxa" w:w="100"/>
-              <w:bottom w:type="dxa" w:w="60"/>
-              <w:right w:type="dxa" w:w="100"/>
-            </w:tcMar>
-          </w:tcPr>
-          <w:p>
-            <w:pPr>
-              <w:spacing w:after="40"/>
-            </w:pPr>
-            <w:r>
-              <w:rPr>
-                <w:rFonts w:ascii="Leelawad UI" w:cs="Leelawad UI" w:eastAsia="Leelawad UI" w:hAnsi="Leelawad UI"/>
-                <w:b w:val="false"/>
-                <w:bCs w:val="false"/>
-                <w:i w:val="false"/>
-                <w:iCs w:val="false"/>
-                <w:color w:val="111111"/>
-                <w:sz w:val="22"/>
-                <w:szCs w:val="22"/>
-              </w:rPr>
-              <w:t xml:space="preserve">ตามงาน — แบบงาน</w:t>
+            <w:tcMar>
+              <w:top w:type="dxa" w:w="60"/>
+              <w:left w:type="dxa" w:w="100"/>
+              <w:bottom w:type="dxa" w:w="60"/>
+              <w:right w:type="dxa" w:w="100"/>
+            </w:tcMar>
+          </w:tcPr>
+          <w:p>
+            <w:pPr>
+              <w:spacing w:after="40"/>
+            </w:pPr>
+            <w:r>
+              <w:rPr>
+                <w:rFonts w:ascii="Leelawad UI" w:cs="Leelawad UI" w:eastAsia="Leelawad UI" w:hAnsi="Leelawad UI"/>
+                <w:b w:val="false"/>
+                <w:bCs w:val="false"/>
+                <w:i w:val="false"/>
+                <w:iCs w:val="false"/>
+                <w:color w:val="111111"/>
+                <w:sz w:val="22"/>
+                <w:szCs w:val="22"/>
+              </w:rPr>
+              <w:t xml:space="preserve">กล่องของขวัญ — ต่อกล่อง</w:t>
             </w:r>
           </w:p>
         </w:tc>
         <w:tc>
           <w:tcPr>
             <w:tcW w:type="dxa" w:w="3526"/>
-            <w:shd w:fill="FAFAFA" w:val="clear"/>
-            <w:tcMar>
-              <w:top w:type="dxa" w:w="60"/>
-              <w:left w:type="dxa" w:w="100"/>
-              <w:bottom w:type="dxa" w:w="60"/>
-              <w:right w:type="dxa" w:w="100"/>
-            </w:tcMar>
-          </w:tcPr>
-          <w:p>
-            <w:pPr>
-              <w:spacing w:after="40"/>
-            </w:pPr>
-            <w:r>
-              <w:rPr>
-                <w:rFonts w:ascii="Leelawad UI" w:cs="Leelawad UI" w:eastAsia="Leelawad UI" w:hAnsi="Leelawad UI"/>
-                <w:b w:val="false"/>
-                <w:bCs w:val="false"/>
-                <w:i w:val="false"/>
-                <w:iCs w:val="false"/>
-                <w:color w:val="111111"/>
-                <w:sz w:val="22"/>
-                <w:szCs w:val="22"/>
-              </w:rPr>
-              <w:t xml:space="preserve">งานเดี่ยว / งานหลายรายการ / งานประจำ · สร้างในกลุ่มผ่านเว็บ LIFF · การเตือนอัตโนมัติยังปิดอยู่</w:t>
+            <w:tcMar>
+              <w:top w:type="dxa" w:w="60"/>
+              <w:left w:type="dxa" w:w="100"/>
+              <w:bottom w:type="dxa" w:w="60"/>
+              <w:right w:type="dxa" w:w="100"/>
+            </w:tcMar>
+          </w:tcPr>
+          <w:p>
+            <w:pPr>
+              <w:spacing w:after="40"/>
+            </w:pPr>
+            <w:r>
+              <w:rPr>
+                <w:rFonts w:ascii="Leelawad UI" w:cs="Leelawad UI" w:eastAsia="Leelawad UI" w:hAnsi="Leelawad UI"/>
+                <w:b w:val="false"/>
+                <w:bCs w:val="false"/>
+                <w:i w:val="false"/>
+                <w:iCs w:val="false"/>
+                <w:color w:val="111111"/>
+                <w:sz w:val="22"/>
+                <w:szCs w:val="22"/>
+              </w:rPr>
+              <w:t xml:space="preserve">รูป 1–10 รูป (ต้นฉบับ ≤ 20 MB/รูป) · ข้อความ ≤ 500 ตัวอักษร · เสียงพูด (ไม่บังคับ) ≤ 5 MB ~60 วิ · สร้างพร้อมกันได้สูงสุด 10 กล่อง</w:t>
             </w:r>
           </w:p>
         </w:tc>
@@ -30641,58 +30776,60 @@
         <w:tc>
           <w:tcPr>
             <w:tcW w:type="dxa" w:w="5500"/>
-            <w:tcMar>
-              <w:top w:type="dxa" w:w="60"/>
-              <w:left w:type="dxa" w:w="100"/>
-              <w:bottom w:type="dxa" w:w="60"/>
-              <w:right w:type="dxa" w:w="100"/>
-            </w:tcMar>
-          </w:tcPr>
-          <w:p>
-            <w:pPr>
-              <w:spacing w:after="40"/>
-            </w:pPr>
-            <w:r>
-              <w:rPr>
-                <w:rFonts w:ascii="Leelawad UI" w:cs="Leelawad UI" w:eastAsia="Leelawad UI" w:hAnsi="Leelawad UI"/>
-                <w:b w:val="false"/>
-                <w:bCs w:val="false"/>
-                <w:i w:val="false"/>
-                <w:iCs w:val="false"/>
-                <w:color w:val="111111"/>
-                <w:sz w:val="22"/>
-                <w:szCs w:val="22"/>
-              </w:rPr>
-              <w:t xml:space="preserve">ถังขยะ — เก็บไฟล์ที่ลบก่อนล้างจริง</w:t>
+            <w:shd w:fill="FAFAFA" w:val="clear"/>
+            <w:tcMar>
+              <w:top w:type="dxa" w:w="60"/>
+              <w:left w:type="dxa" w:w="100"/>
+              <w:bottom w:type="dxa" w:w="60"/>
+              <w:right w:type="dxa" w:w="100"/>
+            </w:tcMar>
+          </w:tcPr>
+          <w:p>
+            <w:pPr>
+              <w:spacing w:after="40"/>
+            </w:pPr>
+            <w:r>
+              <w:rPr>
+                <w:rFonts w:ascii="Leelawad UI" w:cs="Leelawad UI" w:eastAsia="Leelawad UI" w:hAnsi="Leelawad UI"/>
+                <w:b w:val="false"/>
+                <w:bCs w:val="false"/>
+                <w:i w:val="false"/>
+                <w:iCs w:val="false"/>
+                <w:color w:val="111111"/>
+                <w:sz w:val="22"/>
+                <w:szCs w:val="22"/>
+              </w:rPr>
+              <w:t>ตามงาน — แบบงาน ขอบเขต และลิมิต</w:t>
             </w:r>
           </w:p>
         </w:tc>
         <w:tc>
           <w:tcPr>
             <w:tcW w:type="dxa" w:w="3526"/>
-            <w:tcMar>
-              <w:top w:type="dxa" w:w="60"/>
-              <w:left w:type="dxa" w:w="100"/>
-              <w:bottom w:type="dxa" w:w="60"/>
-              <w:right w:type="dxa" w:w="100"/>
-            </w:tcMar>
-          </w:tcPr>
-          <w:p>
-            <w:pPr>
-              <w:spacing w:after="40"/>
-            </w:pPr>
-            <w:r>
-              <w:rPr>
-                <w:rFonts w:ascii="Leelawad UI" w:cs="Leelawad UI" w:eastAsia="Leelawad UI" w:hAnsi="Leelawad UI"/>
-                <w:b w:val="false"/>
-                <w:bCs w:val="false"/>
-                <w:i w:val="false"/>
-                <w:iCs w:val="false"/>
-                <w:color w:val="111111"/>
-                <w:sz w:val="22"/>
-                <w:szCs w:val="22"/>
-              </w:rPr>
-              <w:t xml:space="preserve">ฟรี 5 วัน · แผนโปร 30 วัน (กู้คืนได้ในช่วงนี้)</w:t>
+            <w:shd w:fill="FAFAFA" w:val="clear"/>
+            <w:tcMar>
+              <w:top w:type="dxa" w:w="60"/>
+              <w:left w:type="dxa" w:w="100"/>
+              <w:bottom w:type="dxa" w:w="60"/>
+              <w:right w:type="dxa" w:w="100"/>
+            </w:tcMar>
+          </w:tcPr>
+          <w:p>
+            <w:pPr>
+              <w:spacing w:after="40"/>
+            </w:pPr>
+            <w:r>
+              <w:rPr>
+                <w:rFonts w:ascii="Leelawad UI" w:cs="Leelawad UI" w:eastAsia="Leelawad UI" w:hAnsi="Leelawad UI"/>
+                <w:b w:val="false"/>
+                <w:bCs w:val="false"/>
+                <w:i w:val="false"/>
+                <w:iCs w:val="false"/>
+                <w:color w:val="111111"/>
+                <w:sz w:val="22"/>
+                <w:szCs w:val="22"/>
+              </w:rPr>
+              <w:t>"งานเดียว มอบหลายคน" / "แยกงานเป็นรายการ" / "งานประจำ" · ใช้ได้ทั้งในกลุ่ม (มอบหมายสมาชิก) และในแชทส่วนตัว (งานส่วนตัว มีแค่เจ้าของ) · เข้าด้วยคำสั่ง "หนูเก็บสร้างงาน" แล้วกรอกในหน้าเว็บ LIFF · แนบไฟล์ 5 ไฟล์/ครั้ง ไฟล์ละ ≤ 20 MB สูงสุด 30 ไฟล์/งาน · แนบลิงก์สูงสุด 20 ลิงก์/งาน · ส่งงานกลับ → รับงาน/ตีกลับ (ตีกลับต้องใส่เหตุผล) · ดาวน์โหลดสรุปเป็น .xlsx ได้ฟรี · ไฟล์ปฏิทิน .ics ได้ · จำนวนงานไม่จำกัด · การเตือนอัตโนมัติยังปิดอยู่</w:t>
             </w:r>
           </w:p>
         </w:tc>
@@ -30701,60 +30838,58 @@
         <w:tc>
           <w:tcPr>
             <w:tcW w:type="dxa" w:w="5500"/>
-            <w:shd w:fill="FAFAFA" w:val="clear"/>
-            <w:tcMar>
-              <w:top w:type="dxa" w:w="60"/>
-              <w:left w:type="dxa" w:w="100"/>
-              <w:bottom w:type="dxa" w:w="60"/>
-              <w:right w:type="dxa" w:w="100"/>
-            </w:tcMar>
-          </w:tcPr>
-          <w:p>
-            <w:pPr>
-              <w:spacing w:after="40"/>
-            </w:pPr>
-            <w:r>
-              <w:rPr>
-                <w:rFonts w:ascii="Leelawad UI" w:cs="Leelawad UI" w:eastAsia="Leelawad UI" w:hAnsi="Leelawad UI"/>
-                <w:b w:val="false"/>
-                <w:bCs w:val="false"/>
-                <w:i w:val="false"/>
-                <w:iCs w:val="false"/>
-                <w:color w:val="111111"/>
-                <w:sz w:val="22"/>
-                <w:szCs w:val="22"/>
-              </w:rPr>
-              <w:t xml:space="preserve">ลิงก์ดาวน์โหลด</w:t>
+            <w:tcMar>
+              <w:top w:type="dxa" w:w="60"/>
+              <w:left w:type="dxa" w:w="100"/>
+              <w:bottom w:type="dxa" w:w="60"/>
+              <w:right w:type="dxa" w:w="100"/>
+            </w:tcMar>
+          </w:tcPr>
+          <w:p>
+            <w:pPr>
+              <w:spacing w:after="40"/>
+            </w:pPr>
+            <w:r>
+              <w:rPr>
+                <w:rFonts w:ascii="Leelawad UI" w:cs="Leelawad UI" w:eastAsia="Leelawad UI" w:hAnsi="Leelawad UI"/>
+                <w:b w:val="false"/>
+                <w:bCs w:val="false"/>
+                <w:i w:val="false"/>
+                <w:iCs w:val="false"/>
+                <w:color w:val="111111"/>
+                <w:sz w:val="22"/>
+                <w:szCs w:val="22"/>
+              </w:rPr>
+              <w:t xml:space="preserve">ถังขยะ — เก็บไฟล์ที่ลบก่อนล้างจริง</w:t>
             </w:r>
           </w:p>
         </w:tc>
         <w:tc>
           <w:tcPr>
             <w:tcW w:type="dxa" w:w="3526"/>
-            <w:shd w:fill="FAFAFA" w:val="clear"/>
-            <w:tcMar>
-              <w:top w:type="dxa" w:w="60"/>
-              <w:left w:type="dxa" w:w="100"/>
-              <w:bottom w:type="dxa" w:w="60"/>
-              <w:right w:type="dxa" w:w="100"/>
-            </w:tcMar>
-          </w:tcPr>
-          <w:p>
-            <w:pPr>
-              <w:spacing w:after="40"/>
-            </w:pPr>
-            <w:r>
-              <w:rPr>
-                <w:rFonts w:ascii="Leelawad UI" w:cs="Leelawad UI" w:eastAsia="Leelawad UI" w:hAnsi="Leelawad UI"/>
-                <w:b w:val="false"/>
-                <w:bCs w:val="false"/>
-                <w:i w:val="false"/>
-                <w:iCs w:val="false"/>
-                <w:color w:val="111111"/>
-                <w:sz w:val="22"/>
-                <w:szCs w:val="22"/>
-              </w:rPr>
-              <w:t xml:space="preserve">ลิงก์ชั่วคราว หมดอายุใน 1 ชั่วโมง (ห้องนิรภัยไม่มีดาวน์โหลด — ดูอย่างเดียว)</w:t>
+            <w:tcMar>
+              <w:top w:type="dxa" w:w="60"/>
+              <w:left w:type="dxa" w:w="100"/>
+              <w:bottom w:type="dxa" w:w="60"/>
+              <w:right w:type="dxa" w:w="100"/>
+            </w:tcMar>
+          </w:tcPr>
+          <w:p>
+            <w:pPr>
+              <w:spacing w:after="40"/>
+            </w:pPr>
+            <w:r>
+              <w:rPr>
+                <w:rFonts w:ascii="Leelawad UI" w:cs="Leelawad UI" w:eastAsia="Leelawad UI" w:hAnsi="Leelawad UI"/>
+                <w:b w:val="false"/>
+                <w:bCs w:val="false"/>
+                <w:i w:val="false"/>
+                <w:iCs w:val="false"/>
+                <w:color w:val="111111"/>
+                <w:sz w:val="22"/>
+                <w:szCs w:val="22"/>
+              </w:rPr>
+              <w:t xml:space="preserve">ฟรี 5 วัน · แผนโปร 30 วัน (กู้คืนได้ในช่วงนี้)</w:t>
             </w:r>
           </w:p>
         </w:tc>
@@ -30763,58 +30898,60 @@
         <w:tc>
           <w:tcPr>
             <w:tcW w:type="dxa" w:w="5500"/>
-            <w:tcMar>
-              <w:top w:type="dxa" w:w="60"/>
-              <w:left w:type="dxa" w:w="100"/>
-              <w:bottom w:type="dxa" w:w="60"/>
-              <w:right w:type="dxa" w:w="100"/>
-            </w:tcMar>
-          </w:tcPr>
-          <w:p>
-            <w:pPr>
-              <w:spacing w:after="40"/>
-            </w:pPr>
-            <w:r>
-              <w:rPr>
-                <w:rFonts w:ascii="Leelawad UI" w:cs="Leelawad UI" w:eastAsia="Leelawad UI" w:hAnsi="Leelawad UI"/>
-                <w:b w:val="false"/>
-                <w:bCs w:val="false"/>
-                <w:i w:val="false"/>
-                <w:iCs w:val="false"/>
-                <w:color w:val="111111"/>
-                <w:sz w:val="22"/>
-                <w:szCs w:val="22"/>
-              </w:rPr>
-              <w:t xml:space="preserve">ฟีเจอร์เฉพาะแชทส่วนตัว</w:t>
+            <w:shd w:fill="FAFAFA" w:val="clear"/>
+            <w:tcMar>
+              <w:top w:type="dxa" w:w="60"/>
+              <w:left w:type="dxa" w:w="100"/>
+              <w:bottom w:type="dxa" w:w="60"/>
+              <w:right w:type="dxa" w:w="100"/>
+            </w:tcMar>
+          </w:tcPr>
+          <w:p>
+            <w:pPr>
+              <w:spacing w:after="40"/>
+            </w:pPr>
+            <w:r>
+              <w:rPr>
+                <w:rFonts w:ascii="Leelawad UI" w:cs="Leelawad UI" w:eastAsia="Leelawad UI" w:hAnsi="Leelawad UI"/>
+                <w:b w:val="false"/>
+                <w:bCs w:val="false"/>
+                <w:i w:val="false"/>
+                <w:iCs w:val="false"/>
+                <w:color w:val="111111"/>
+                <w:sz w:val="22"/>
+                <w:szCs w:val="22"/>
+              </w:rPr>
+              <w:t xml:space="preserve">ลิงก์ดาวน์โหลด</w:t>
             </w:r>
           </w:p>
         </w:tc>
         <w:tc>
           <w:tcPr>
             <w:tcW w:type="dxa" w:w="3526"/>
-            <w:tcMar>
-              <w:top w:type="dxa" w:w="60"/>
-              <w:left w:type="dxa" w:w="100"/>
-              <w:bottom w:type="dxa" w:w="60"/>
-              <w:right w:type="dxa" w:w="100"/>
-            </w:tcMar>
-          </w:tcPr>
-          <w:p>
-            <w:pPr>
-              <w:spacing w:after="40"/>
-            </w:pPr>
-            <w:r>
-              <w:rPr>
-                <w:rFonts w:ascii="Leelawad UI" w:cs="Leelawad UI" w:eastAsia="Leelawad UI" w:hAnsi="Leelawad UI"/>
-                <w:b w:val="false"/>
-                <w:bCs w:val="false"/>
-                <w:i w:val="false"/>
-                <w:iCs w:val="false"/>
-                <w:color w:val="111111"/>
-                <w:sz w:val="22"/>
-                <w:szCs w:val="22"/>
-              </w:rPr>
-              <w:t xml:space="preserve">สแกน PDF · รวมรูป · แปลงไฟล์ · ไดอารี่</w:t>
+            <w:shd w:fill="FAFAFA" w:val="clear"/>
+            <w:tcMar>
+              <w:top w:type="dxa" w:w="60"/>
+              <w:left w:type="dxa" w:w="100"/>
+              <w:bottom w:type="dxa" w:w="60"/>
+              <w:right w:type="dxa" w:w="100"/>
+            </w:tcMar>
+          </w:tcPr>
+          <w:p>
+            <w:pPr>
+              <w:spacing w:after="40"/>
+            </w:pPr>
+            <w:r>
+              <w:rPr>
+                <w:rFonts w:ascii="Leelawad UI" w:cs="Leelawad UI" w:eastAsia="Leelawad UI" w:hAnsi="Leelawad UI"/>
+                <w:b w:val="false"/>
+                <w:bCs w:val="false"/>
+                <w:i w:val="false"/>
+                <w:iCs w:val="false"/>
+                <w:color w:val="111111"/>
+                <w:sz w:val="22"/>
+                <w:szCs w:val="22"/>
+              </w:rPr>
+              <w:t xml:space="preserve">ลิงก์ชั่วคราว หมดอายุใน 1 ชั่วโมง (ห้องนิรภัยไม่มีดาวน์โหลด — ดูอย่างเดียว)</w:t>
             </w:r>
           </w:p>
         </w:tc>
@@ -30823,60 +30960,120 @@
         <w:tc>
           <w:tcPr>
             <w:tcW w:type="dxa" w:w="5500"/>
-            <w:shd w:fill="FAFAFA" w:val="clear"/>
-            <w:tcMar>
-              <w:top w:type="dxa" w:w="60"/>
-              <w:left w:type="dxa" w:w="100"/>
-              <w:bottom w:type="dxa" w:w="60"/>
-              <w:right w:type="dxa" w:w="100"/>
-            </w:tcMar>
-          </w:tcPr>
-          <w:p>
-            <w:pPr>
-              <w:spacing w:after="40"/>
-            </w:pPr>
-            <w:r>
-              <w:rPr>
-                <w:rFonts w:ascii="Leelawad UI" w:cs="Leelawad UI" w:eastAsia="Leelawad UI" w:hAnsi="Leelawad UI"/>
-                <w:b w:val="false"/>
-                <w:bCs w:val="false"/>
-                <w:i w:val="false"/>
-                <w:iCs w:val="false"/>
-                <w:color w:val="111111"/>
-                <w:sz w:val="22"/>
-                <w:szCs w:val="22"/>
-              </w:rPr>
-              <w:t xml:space="preserve">ฟีเจอร์เฉพาะบนเว็บ (ไม่มีในแชท)</w:t>
+            <w:tcMar>
+              <w:top w:type="dxa" w:w="60"/>
+              <w:left w:type="dxa" w:w="100"/>
+              <w:bottom w:type="dxa" w:w="60"/>
+              <w:right w:type="dxa" w:w="100"/>
+            </w:tcMar>
+          </w:tcPr>
+          <w:p>
+            <w:pPr>
+              <w:spacing w:after="40"/>
+            </w:pPr>
+            <w:r>
+              <w:rPr>
+                <w:rFonts w:ascii="Leelawad UI" w:cs="Leelawad UI" w:eastAsia="Leelawad UI" w:hAnsi="Leelawad UI"/>
+                <w:b w:val="false"/>
+                <w:bCs w:val="false"/>
+                <w:i w:val="false"/>
+                <w:iCs w:val="false"/>
+                <w:color w:val="111111"/>
+                <w:sz w:val="22"/>
+                <w:szCs w:val="22"/>
+              </w:rPr>
+              <w:t xml:space="preserve">ฟีเจอร์เฉพาะแชทส่วนตัว</w:t>
             </w:r>
           </w:p>
         </w:tc>
         <w:tc>
           <w:tcPr>
             <w:tcW w:type="dxa" w:w="3526"/>
-            <w:shd w:fill="FAFAFA" w:val="clear"/>
-            <w:tcMar>
-              <w:top w:type="dxa" w:w="60"/>
-              <w:left w:type="dxa" w:w="100"/>
-              <w:bottom w:type="dxa" w:w="60"/>
-              <w:right w:type="dxa" w:w="100"/>
-            </w:tcMar>
-          </w:tcPr>
-          <w:p>
-            <w:pPr>
-              <w:spacing w:after="40"/>
-            </w:pPr>
-            <w:r>
-              <w:rPr>
-                <w:rFonts w:ascii="Leelawad UI" w:cs="Leelawad UI" w:eastAsia="Leelawad UI" w:hAnsi="Leelawad UI"/>
-                <w:b w:val="false"/>
-                <w:bCs w:val="false"/>
-                <w:i w:val="false"/>
-                <w:iCs w:val="false"/>
-                <w:color w:val="111111"/>
-                <w:sz w:val="22"/>
-                <w:szCs w:val="22"/>
-              </w:rPr>
-              <w:t xml:space="preserve">ห้องนิรภัย · กล่องของขวัญ · ถังขยะ</w:t>
+            <w:tcMar>
+              <w:top w:type="dxa" w:w="60"/>
+              <w:left w:type="dxa" w:w="100"/>
+              <w:bottom w:type="dxa" w:w="60"/>
+              <w:right w:type="dxa" w:w="100"/>
+            </w:tcMar>
+          </w:tcPr>
+          <w:p>
+            <w:pPr>
+              <w:spacing w:after="40"/>
+            </w:pPr>
+            <w:r>
+              <w:rPr>
+                <w:rFonts w:ascii="Leelawad UI" w:cs="Leelawad UI" w:eastAsia="Leelawad UI" w:hAnsi="Leelawad UI"/>
+                <w:b w:val="false"/>
+                <w:bCs w:val="false"/>
+                <w:i w:val="false"/>
+                <w:iCs w:val="false"/>
+                <w:color w:val="111111"/>
+                <w:sz w:val="22"/>
+                <w:szCs w:val="22"/>
+              </w:rPr>
+              <w:t>สแกน PDF · รวมรูป · รวมไฟล์ PDF · แปลงไฟล์ · ไดอารี่</w:t>
+            </w:r>
+          </w:p>
+        </w:tc>
+      </w:tr>
+      <w:tr>
+        <w:tc>
+          <w:tcPr>
+            <w:tcW w:type="dxa" w:w="5500"/>
+            <w:shd w:fill="FAFAFA" w:val="clear"/>
+            <w:tcMar>
+              <w:top w:type="dxa" w:w="60"/>
+              <w:left w:type="dxa" w:w="100"/>
+              <w:bottom w:type="dxa" w:w="60"/>
+              <w:right w:type="dxa" w:w="100"/>
+            </w:tcMar>
+          </w:tcPr>
+          <w:p>
+            <w:pPr>
+              <w:spacing w:after="40"/>
+            </w:pPr>
+            <w:r>
+              <w:rPr>
+                <w:rFonts w:ascii="Leelawad UI" w:cs="Leelawad UI" w:eastAsia="Leelawad UI" w:hAnsi="Leelawad UI"/>
+                <w:b w:val="false"/>
+                <w:bCs w:val="false"/>
+                <w:i w:val="false"/>
+                <w:iCs w:val="false"/>
+                <w:color w:val="111111"/>
+                <w:sz w:val="22"/>
+                <w:szCs w:val="22"/>
+              </w:rPr>
+              <w:t>ฟีเจอร์ที่ทำจริงบนเว็บ (แชทมีแค่คำสั่งเปิดลิงก์)</w:t>
+            </w:r>
+          </w:p>
+        </w:tc>
+        <w:tc>
+          <w:tcPr>
+            <w:tcW w:type="dxa" w:w="3526"/>
+            <w:shd w:fill="FAFAFA" w:val="clear"/>
+            <w:tcMar>
+              <w:top w:type="dxa" w:w="60"/>
+              <w:left w:type="dxa" w:w="100"/>
+              <w:bottom w:type="dxa" w:w="60"/>
+              <w:right w:type="dxa" w:w="100"/>
+            </w:tcMar>
+          </w:tcPr>
+          <w:p>
+            <w:pPr>
+              <w:spacing w:after="40"/>
+            </w:pPr>
+            <w:r>
+              <w:rPr>
+                <w:rFonts w:ascii="Leelawad UI" w:cs="Leelawad UI" w:eastAsia="Leelawad UI" w:hAnsi="Leelawad UI"/>
+                <w:b w:val="false"/>
+                <w:bCs w:val="false"/>
+                <w:i w:val="false"/>
+                <w:iCs w:val="false"/>
+                <w:color w:val="111111"/>
+                <w:sz w:val="22"/>
+                <w:szCs w:val="22"/>
+              </w:rPr>
+              <w:t>ห้องนิรภัย · กล่องของขวัญ · ถังขยะ — ทำงานจริงบนแดชบอร์ดเว็บ · ในแชทมีคำสั่งลัดที่ส่งลิงก์เปิดหน้าเว็บให้: "หนูเก็บห้องนิรภัย" · "หนูเก็บกล่องของขวัญ" · "หนูเก็บงานของฉัน" (ถังขยะยังไม่มีคำสั่งลัด)</w:t>
             </w:r>
           </w:p>
         </w:tc>
@@ -31037,7 +31234,7 @@
                 <w:sz w:val="22"/>
                 <w:szCs w:val="22"/>
               </w:rPr>
-              <w:t xml:space="preserve">"หนูเก็บ" (เปิดเมนู) · หนูเก็บวิธีใช้ · หนูเก็บแนะนำตัว · หนูเก็บคำสั่ง · หนูเก็บช่วยเหลือ</w:t>
+              <w:t>"หนูเก็บ" (เปิดเมนูหลัก) · หนูเก็บวิธีใช้ · หนูเก็บคำสั่ง (ดูคำสั่งทั้งหมด) · หนูเก็บแนะนำตัว · หนูเก็บฟีเจอร์ (เลือกฟีเจอร์ทั้งหมด — แชทส่วนตัว) · หนูเก็บฟีเจอร์เอกสาร (เลือกเฉพาะงานเอกสาร ใช้ได้ทั้งในกลุ่ม) · หนูเก็บเพิ่มเติม · ติดต่อหนูเก็บ (ติดต่อทีมงาน)</w:t>
             </w:r>
           </w:p>
         </w:tc>
@@ -31099,7 +31296,7 @@
                 <w:sz w:val="22"/>
                 <w:szCs w:val="22"/>
               </w:rPr>
-              <w:t xml:space="preserve">หนูเก็บล็อคเกอร์ · หนูเก็บอัพโหลดไฟล์ (แล้วส่งไฟล์เข้าแชทได้เลย)</w:t>
+              <w:t>หนูเก็บล็อคเกอร์ (เปิดคลังไฟล์) · ส่งรูป/ไฟล์/วิดีโอ/เสียงเข้าแชทได้เลยโดยไม่ต้องพิมพ์คำสั่ง</w:t>
             </w:r>
           </w:p>
         </w:tc>
@@ -31159,7 +31356,7 @@
                 <w:sz w:val="22"/>
                 <w:szCs w:val="22"/>
               </w:rPr>
-              <w:t xml:space="preserve">หนูเก็บรวมรูป → ส่งรูปทีละหน้า → พิมพ์ "เสร็จ" (ยกเลิกด้วย "ยกเลิก")</w:t>
+              <w:t>หนูเก็บรวมรูป → ส่งรูปทีละหน้า → พิมพ์ "เสร็จ" (ยกเลิกด้วย "ยกเลิก")</w:t>
             </w:r>
           </w:p>
         </w:tc>
@@ -31168,60 +31365,58 @@
         <w:tc>
           <w:tcPr>
             <w:tcW w:type="dxa" w:w="2800"/>
-            <w:shd w:fill="FAFAFA" w:val="clear"/>
-            <w:tcMar>
-              <w:top w:type="dxa" w:w="60"/>
-              <w:left w:type="dxa" w:w="100"/>
-              <w:bottom w:type="dxa" w:w="60"/>
-              <w:right w:type="dxa" w:w="100"/>
-            </w:tcMar>
-          </w:tcPr>
-          <w:p>
-            <w:pPr>
-              <w:spacing w:after="40"/>
-            </w:pPr>
-            <w:r>
-              <w:rPr>
-                <w:rFonts w:ascii="Leelawad UI" w:cs="Leelawad UI" w:eastAsia="Leelawad UI" w:hAnsi="Leelawad UI"/>
-                <w:b w:val="false"/>
-                <w:bCs w:val="false"/>
-                <w:i w:val="false"/>
-                <w:iCs w:val="false"/>
-                <w:color w:val="111111"/>
-                <w:sz w:val="22"/>
-                <w:szCs w:val="22"/>
-              </w:rPr>
-              <w:t xml:space="preserve">สแกนเอกสาร</w:t>
+            <w:tcMar>
+              <w:top w:type="dxa" w:w="60"/>
+              <w:left w:type="dxa" w:w="100"/>
+              <w:bottom w:type="dxa" w:w="60"/>
+              <w:right w:type="dxa" w:w="100"/>
+            </w:tcMar>
+          </w:tcPr>
+          <w:p>
+            <w:pPr>
+              <w:spacing w:after="40"/>
+            </w:pPr>
+            <w:r>
+              <w:rPr>
+                <w:rFonts w:ascii="Leelawad UI" w:cs="Leelawad UI" w:eastAsia="Leelawad UI" w:hAnsi="Leelawad UI"/>
+                <w:b w:val="false"/>
+                <w:bCs w:val="false"/>
+                <w:i w:val="false"/>
+                <w:iCs w:val="false"/>
+                <w:color w:val="111111"/>
+                <w:sz w:val="22"/>
+                <w:szCs w:val="22"/>
+              </w:rPr>
+              <w:t>รวมไฟล์ PDF เป็นไฟล์เดียว</w:t>
             </w:r>
           </w:p>
         </w:tc>
         <w:tc>
           <w:tcPr>
             <w:tcW w:type="dxa" w:w="6226"/>
-            <w:shd w:fill="FAFAFA" w:val="clear"/>
-            <w:tcMar>
-              <w:top w:type="dxa" w:w="60"/>
-              <w:left w:type="dxa" w:w="100"/>
-              <w:bottom w:type="dxa" w:w="60"/>
-              <w:right w:type="dxa" w:w="100"/>
-            </w:tcMar>
-          </w:tcPr>
-          <w:p>
-            <w:pPr>
-              <w:spacing w:after="40"/>
-            </w:pPr>
-            <w:r>
-              <w:rPr>
-                <w:rFonts w:ascii="Leelawad UI" w:cs="Leelawad UI" w:eastAsia="Leelawad UI" w:hAnsi="Leelawad UI"/>
-                <w:b w:val="false"/>
-                <w:bCs w:val="false"/>
-                <w:i w:val="false"/>
-                <w:iCs w:val="false"/>
-                <w:color w:val="111111"/>
-                <w:sz w:val="22"/>
-                <w:szCs w:val="22"/>
-              </w:rPr>
-              <w:t xml:space="preserve">หนูเก็บสแกน · หนูเก็บสแกนสี · หนูเก็บสแกนขาวดำ → ส่งรูป → "เสร็จ"</w:t>
+            <w:tcMar>
+              <w:top w:type="dxa" w:w="60"/>
+              <w:left w:type="dxa" w:w="100"/>
+              <w:bottom w:type="dxa" w:w="60"/>
+              <w:right w:type="dxa" w:w="100"/>
+            </w:tcMar>
+          </w:tcPr>
+          <w:p>
+            <w:pPr>
+              <w:spacing w:after="40"/>
+            </w:pPr>
+            <w:r>
+              <w:rPr>
+                <w:rFonts w:ascii="Leelawad UI" w:cs="Leelawad UI" w:eastAsia="Leelawad UI" w:hAnsi="Leelawad UI"/>
+                <w:b w:val="false"/>
+                <w:bCs w:val="false"/>
+                <w:i w:val="false"/>
+                <w:iCs w:val="false"/>
+                <w:color w:val="111111"/>
+                <w:sz w:val="22"/>
+                <w:szCs w:val="22"/>
+              </w:rPr>
+              <w:t>หนูเก็บรวมไฟล์ → ส่งไฟล์ PDF ทีละไฟล์ → พิมพ์ "เสร็จ" (ยกเลิกด้วย "ยกเลิก") · แชทส่วนตัวเท่านั้น</w:t>
             </w:r>
           </w:p>
         </w:tc>
@@ -31230,58 +31425,60 @@
         <w:tc>
           <w:tcPr>
             <w:tcW w:type="dxa" w:w="2800"/>
-            <w:tcMar>
-              <w:top w:type="dxa" w:w="60"/>
-              <w:left w:type="dxa" w:w="100"/>
-              <w:bottom w:type="dxa" w:w="60"/>
-              <w:right w:type="dxa" w:w="100"/>
-            </w:tcMar>
-          </w:tcPr>
-          <w:p>
-            <w:pPr>
-              <w:spacing w:after="40"/>
-            </w:pPr>
-            <w:r>
-              <w:rPr>
-                <w:rFonts w:ascii="Leelawad UI" w:cs="Leelawad UI" w:eastAsia="Leelawad UI" w:hAnsi="Leelawad UI"/>
-                <w:b w:val="false"/>
-                <w:bCs w:val="false"/>
-                <w:i w:val="false"/>
-                <w:iCs w:val="false"/>
-                <w:color w:val="111111"/>
-                <w:sz w:val="22"/>
-                <w:szCs w:val="22"/>
-              </w:rPr>
-              <w:t xml:space="preserve">แปลงเป็น Word</w:t>
+            <w:shd w:fill="FAFAFA" w:val="clear"/>
+            <w:tcMar>
+              <w:top w:type="dxa" w:w="60"/>
+              <w:left w:type="dxa" w:w="100"/>
+              <w:bottom w:type="dxa" w:w="60"/>
+              <w:right w:type="dxa" w:w="100"/>
+            </w:tcMar>
+          </w:tcPr>
+          <w:p>
+            <w:pPr>
+              <w:spacing w:after="40"/>
+            </w:pPr>
+            <w:r>
+              <w:rPr>
+                <w:rFonts w:ascii="Leelawad UI" w:cs="Leelawad UI" w:eastAsia="Leelawad UI" w:hAnsi="Leelawad UI"/>
+                <w:b w:val="false"/>
+                <w:bCs w:val="false"/>
+                <w:i w:val="false"/>
+                <w:iCs w:val="false"/>
+                <w:color w:val="111111"/>
+                <w:sz w:val="22"/>
+                <w:szCs w:val="22"/>
+              </w:rPr>
+              <w:t xml:space="preserve">สแกนเอกสาร</w:t>
             </w:r>
           </w:p>
         </w:tc>
         <w:tc>
           <w:tcPr>
             <w:tcW w:type="dxa" w:w="6226"/>
-            <w:tcMar>
-              <w:top w:type="dxa" w:w="60"/>
-              <w:left w:type="dxa" w:w="100"/>
-              <w:bottom w:type="dxa" w:w="60"/>
-              <w:right w:type="dxa" w:w="100"/>
-            </w:tcMar>
-          </w:tcPr>
-          <w:p>
-            <w:pPr>
-              <w:spacing w:after="40"/>
-            </w:pPr>
-            <w:r>
-              <w:rPr>
-                <w:rFonts w:ascii="Leelawad UI" w:cs="Leelawad UI" w:eastAsia="Leelawad UI" w:hAnsi="Leelawad UI"/>
-                <w:b w:val="false"/>
-                <w:bCs w:val="false"/>
-                <w:i w:val="false"/>
-                <w:iCs w:val="false"/>
-                <w:color w:val="111111"/>
-                <w:sz w:val="22"/>
-                <w:szCs w:val="22"/>
-              </w:rPr>
-              <w:t xml:space="preserve">หนูเก็บแปลงไฟล์ → ส่งรูปหรือ PDF 1 ไฟล์</w:t>
+            <w:shd w:fill="FAFAFA" w:val="clear"/>
+            <w:tcMar>
+              <w:top w:type="dxa" w:w="60"/>
+              <w:left w:type="dxa" w:w="100"/>
+              <w:bottom w:type="dxa" w:w="60"/>
+              <w:right w:type="dxa" w:w="100"/>
+            </w:tcMar>
+          </w:tcPr>
+          <w:p>
+            <w:pPr>
+              <w:spacing w:after="40"/>
+            </w:pPr>
+            <w:r>
+              <w:rPr>
+                <w:rFonts w:ascii="Leelawad UI" w:cs="Leelawad UI" w:eastAsia="Leelawad UI" w:hAnsi="Leelawad UI"/>
+                <w:b w:val="false"/>
+                <w:bCs w:val="false"/>
+                <w:i w:val="false"/>
+                <w:iCs w:val="false"/>
+                <w:color w:val="111111"/>
+                <w:sz w:val="22"/>
+                <w:szCs w:val="22"/>
+              </w:rPr>
+              <w:t>หนูเก็บสแกน · หนูเก็บสแกนสี · หนูเก็บสแกนขาวดำ → ส่งรูป → "เสร็จ"</w:t>
             </w:r>
           </w:p>
         </w:tc>
@@ -31290,60 +31487,58 @@
         <w:tc>
           <w:tcPr>
             <w:tcW w:type="dxa" w:w="2800"/>
-            <w:shd w:fill="FAFAFA" w:val="clear"/>
-            <w:tcMar>
-              <w:top w:type="dxa" w:w="60"/>
-              <w:left w:type="dxa" w:w="100"/>
-              <w:bottom w:type="dxa" w:w="60"/>
-              <w:right w:type="dxa" w:w="100"/>
-            </w:tcMar>
-          </w:tcPr>
-          <w:p>
-            <w:pPr>
-              <w:spacing w:after="40"/>
-            </w:pPr>
-            <w:r>
-              <w:rPr>
-                <w:rFonts w:ascii="Leelawad UI" w:cs="Leelawad UI" w:eastAsia="Leelawad UI" w:hAnsi="Leelawad UI"/>
-                <w:b w:val="false"/>
-                <w:bCs w:val="false"/>
-                <w:i w:val="false"/>
-                <w:iCs w:val="false"/>
-                <w:color w:val="111111"/>
-                <w:sz w:val="22"/>
-                <w:szCs w:val="22"/>
-              </w:rPr>
-              <w:t xml:space="preserve">ไดอารี่ 365 วัน</w:t>
+            <w:tcMar>
+              <w:top w:type="dxa" w:w="60"/>
+              <w:left w:type="dxa" w:w="100"/>
+              <w:bottom w:type="dxa" w:w="60"/>
+              <w:right w:type="dxa" w:w="100"/>
+            </w:tcMar>
+          </w:tcPr>
+          <w:p>
+            <w:pPr>
+              <w:spacing w:after="40"/>
+            </w:pPr>
+            <w:r>
+              <w:rPr>
+                <w:rFonts w:ascii="Leelawad UI" w:cs="Leelawad UI" w:eastAsia="Leelawad UI" w:hAnsi="Leelawad UI"/>
+                <w:b w:val="false"/>
+                <w:bCs w:val="false"/>
+                <w:i w:val="false"/>
+                <w:iCs w:val="false"/>
+                <w:color w:val="111111"/>
+                <w:sz w:val="22"/>
+                <w:szCs w:val="22"/>
+              </w:rPr>
+              <w:t xml:space="preserve">แปลงเป็น Word</w:t>
             </w:r>
           </w:p>
         </w:tc>
         <w:tc>
           <w:tcPr>
             <w:tcW w:type="dxa" w:w="6226"/>
-            <w:shd w:fill="FAFAFA" w:val="clear"/>
-            <w:tcMar>
-              <w:top w:type="dxa" w:w="60"/>
-              <w:left w:type="dxa" w:w="100"/>
-              <w:bottom w:type="dxa" w:w="60"/>
-              <w:right w:type="dxa" w:w="100"/>
-            </w:tcMar>
-          </w:tcPr>
-          <w:p>
-            <w:pPr>
-              <w:spacing w:after="40"/>
-            </w:pPr>
-            <w:r>
-              <w:rPr>
-                <w:rFonts w:ascii="Leelawad UI" w:cs="Leelawad UI" w:eastAsia="Leelawad UI" w:hAnsi="Leelawad UI"/>
-                <w:b w:val="false"/>
-                <w:bCs w:val="false"/>
-                <w:i w:val="false"/>
-                <w:iCs w:val="false"/>
-                <w:color w:val="111111"/>
-                <w:sz w:val="22"/>
-                <w:szCs w:val="22"/>
-              </w:rPr>
-              <w:t xml:space="preserve">หนูเก็บไดอารี่ → (พิมพ์แคปชั่นได้) → ส่งรูป 1 รูป</w:t>
+            <w:tcMar>
+              <w:top w:type="dxa" w:w="60"/>
+              <w:left w:type="dxa" w:w="100"/>
+              <w:bottom w:type="dxa" w:w="60"/>
+              <w:right w:type="dxa" w:w="100"/>
+            </w:tcMar>
+          </w:tcPr>
+          <w:p>
+            <w:pPr>
+              <w:spacing w:after="40"/>
+            </w:pPr>
+            <w:r>
+              <w:rPr>
+                <w:rFonts w:ascii="Leelawad UI" w:cs="Leelawad UI" w:eastAsia="Leelawad UI" w:hAnsi="Leelawad UI"/>
+                <w:b w:val="false"/>
+                <w:bCs w:val="false"/>
+                <w:i w:val="false"/>
+                <w:iCs w:val="false"/>
+                <w:color w:val="111111"/>
+                <w:sz w:val="22"/>
+                <w:szCs w:val="22"/>
+              </w:rPr>
+              <w:t>หนูเก็บแปลงไฟล์ → ส่งรูปหรือ PDF 1 ไฟล์</w:t>
             </w:r>
           </w:p>
         </w:tc>
@@ -31352,58 +31547,60 @@
         <w:tc>
           <w:tcPr>
             <w:tcW w:type="dxa" w:w="2800"/>
-            <w:tcMar>
-              <w:top w:type="dxa" w:w="60"/>
-              <w:left w:type="dxa" w:w="100"/>
-              <w:bottom w:type="dxa" w:w="60"/>
-              <w:right w:type="dxa" w:w="100"/>
-            </w:tcMar>
-          </w:tcPr>
-          <w:p>
-            <w:pPr>
-              <w:spacing w:after="40"/>
-            </w:pPr>
-            <w:r>
-              <w:rPr>
-                <w:rFonts w:ascii="Leelawad UI" w:cs="Leelawad UI" w:eastAsia="Leelawad UI" w:hAnsi="Leelawad UI"/>
-                <w:b w:val="false"/>
-                <w:bCs w:val="false"/>
-                <w:i w:val="false"/>
-                <w:iCs w:val="false"/>
-                <w:color w:val="111111"/>
-                <w:sz w:val="22"/>
-                <w:szCs w:val="22"/>
-              </w:rPr>
-              <w:t xml:space="preserve">ทีม (ใช้ในกลุ่ม)</w:t>
+            <w:shd w:fill="FAFAFA" w:val="clear"/>
+            <w:tcMar>
+              <w:top w:type="dxa" w:w="60"/>
+              <w:left w:type="dxa" w:w="100"/>
+              <w:bottom w:type="dxa" w:w="60"/>
+              <w:right w:type="dxa" w:w="100"/>
+            </w:tcMar>
+          </w:tcPr>
+          <w:p>
+            <w:pPr>
+              <w:spacing w:after="40"/>
+            </w:pPr>
+            <w:r>
+              <w:rPr>
+                <w:rFonts w:ascii="Leelawad UI" w:cs="Leelawad UI" w:eastAsia="Leelawad UI" w:hAnsi="Leelawad UI"/>
+                <w:b w:val="false"/>
+                <w:bCs w:val="false"/>
+                <w:i w:val="false"/>
+                <w:iCs w:val="false"/>
+                <w:color w:val="111111"/>
+                <w:sz w:val="22"/>
+                <w:szCs w:val="22"/>
+              </w:rPr>
+              <w:t xml:space="preserve">ไดอารี่ 365 วัน</w:t>
             </w:r>
           </w:p>
         </w:tc>
         <w:tc>
           <w:tcPr>
             <w:tcW w:type="dxa" w:w="6226"/>
-            <w:tcMar>
-              <w:top w:type="dxa" w:w="60"/>
-              <w:left w:type="dxa" w:w="100"/>
-              <w:bottom w:type="dxa" w:w="60"/>
-              <w:right w:type="dxa" w:w="100"/>
-            </w:tcMar>
-          </w:tcPr>
-          <w:p>
-            <w:pPr>
-              <w:spacing w:after="40"/>
-            </w:pPr>
-            <w:r>
-              <w:rPr>
-                <w:rFonts w:ascii="Leelawad UI" w:cs="Leelawad UI" w:eastAsia="Leelawad UI" w:hAnsi="Leelawad UI"/>
-                <w:b w:val="false"/>
-                <w:bCs w:val="false"/>
-                <w:i w:val="false"/>
-                <w:iCs w:val="false"/>
-                <w:color w:val="111111"/>
-                <w:sz w:val="22"/>
-                <w:szCs w:val="22"/>
-              </w:rPr>
-              <w:t xml:space="preserve">หนูเก็บผูกทีม · หนูเก็บยกเลิกผูกทีม · หนูเก็บไอดีกลุ่ม · หนูเก็บปิดแจ้งเตือน · หนูเก็บเปิดแจ้งเตือน</w:t>
+            <w:shd w:fill="FAFAFA" w:val="clear"/>
+            <w:tcMar>
+              <w:top w:type="dxa" w:w="60"/>
+              <w:left w:type="dxa" w:w="100"/>
+              <w:bottom w:type="dxa" w:w="60"/>
+              <w:right w:type="dxa" w:w="100"/>
+            </w:tcMar>
+          </w:tcPr>
+          <w:p>
+            <w:pPr>
+              <w:spacing w:after="40"/>
+            </w:pPr>
+            <w:r>
+              <w:rPr>
+                <w:rFonts w:ascii="Leelawad UI" w:cs="Leelawad UI" w:eastAsia="Leelawad UI" w:hAnsi="Leelawad UI"/>
+                <w:b w:val="false"/>
+                <w:bCs w:val="false"/>
+                <w:i w:val="false"/>
+                <w:iCs w:val="false"/>
+                <w:color w:val="111111"/>
+                <w:sz w:val="22"/>
+                <w:szCs w:val="22"/>
+              </w:rPr>
+              <w:t>หนูเก็บไดอารี่ → (พิมพ์แคปชั่นได้) → ส่งรูป 1 รูป</w:t>
             </w:r>
           </w:p>
         </w:tc>
@@ -31412,60 +31609,58 @@
         <w:tc>
           <w:tcPr>
             <w:tcW w:type="dxa" w:w="2800"/>
-            <w:shd w:fill="FAFAFA" w:val="clear"/>
-            <w:tcMar>
-              <w:top w:type="dxa" w:w="60"/>
-              <w:left w:type="dxa" w:w="100"/>
-              <w:bottom w:type="dxa" w:w="60"/>
-              <w:right w:type="dxa" w:w="100"/>
-            </w:tcMar>
-          </w:tcPr>
-          <w:p>
-            <w:pPr>
-              <w:spacing w:after="40"/>
-            </w:pPr>
-            <w:r>
-              <w:rPr>
-                <w:rFonts w:ascii="Leelawad UI" w:cs="Leelawad UI" w:eastAsia="Leelawad UI" w:hAnsi="Leelawad UI"/>
-                <w:b w:val="false"/>
-                <w:bCs w:val="false"/>
-                <w:i w:val="false"/>
-                <w:iCs w:val="false"/>
-                <w:color w:val="111111"/>
-                <w:sz w:val="22"/>
-                <w:szCs w:val="22"/>
-              </w:rPr>
-              <w:t xml:space="preserve">ชวนเพื่อน</w:t>
+            <w:tcMar>
+              <w:top w:type="dxa" w:w="60"/>
+              <w:left w:type="dxa" w:w="100"/>
+              <w:bottom w:type="dxa" w:w="60"/>
+              <w:right w:type="dxa" w:w="100"/>
+            </w:tcMar>
+          </w:tcPr>
+          <w:p>
+            <w:pPr>
+              <w:spacing w:after="40"/>
+            </w:pPr>
+            <w:r>
+              <w:rPr>
+                <w:rFonts w:ascii="Leelawad UI" w:cs="Leelawad UI" w:eastAsia="Leelawad UI" w:hAnsi="Leelawad UI"/>
+                <w:b w:val="false"/>
+                <w:bCs w:val="false"/>
+                <w:i w:val="false"/>
+                <w:iCs w:val="false"/>
+                <w:color w:val="111111"/>
+                <w:sz w:val="22"/>
+                <w:szCs w:val="22"/>
+              </w:rPr>
+              <w:t xml:space="preserve">ทีม (ใช้ในกลุ่ม)</w:t>
             </w:r>
           </w:p>
         </w:tc>
         <w:tc>
           <w:tcPr>
             <w:tcW w:type="dxa" w:w="6226"/>
-            <w:shd w:fill="FAFAFA" w:val="clear"/>
-            <w:tcMar>
-              <w:top w:type="dxa" w:w="60"/>
-              <w:left w:type="dxa" w:w="100"/>
-              <w:bottom w:type="dxa" w:w="60"/>
-              <w:right w:type="dxa" w:w="100"/>
-            </w:tcMar>
-          </w:tcPr>
-          <w:p>
-            <w:pPr>
-              <w:spacing w:after="40"/>
-            </w:pPr>
-            <w:r>
-              <w:rPr>
-                <w:rFonts w:ascii="Leelawad UI" w:cs="Leelawad UI" w:eastAsia="Leelawad UI" w:hAnsi="Leelawad UI"/>
-                <w:b w:val="false"/>
-                <w:bCs w:val="false"/>
-                <w:i w:val="false"/>
-                <w:iCs w:val="false"/>
-                <w:color w:val="111111"/>
-                <w:sz w:val="22"/>
-                <w:szCs w:val="22"/>
-              </w:rPr>
-              <w:t xml:space="preserve">หนูเก็บเชิญ (ดูโค้ดตัวเอง) · หนูเก็บกรอกโค้ด [โค้ด]</w:t>
+            <w:tcMar>
+              <w:top w:type="dxa" w:w="60"/>
+              <w:left w:type="dxa" w:w="100"/>
+              <w:bottom w:type="dxa" w:w="60"/>
+              <w:right w:type="dxa" w:w="100"/>
+            </w:tcMar>
+          </w:tcPr>
+          <w:p>
+            <w:pPr>
+              <w:spacing w:after="40"/>
+            </w:pPr>
+            <w:r>
+              <w:rPr>
+                <w:rFonts w:ascii="Leelawad UI" w:cs="Leelawad UI" w:eastAsia="Leelawad UI" w:hAnsi="Leelawad UI"/>
+                <w:b w:val="false"/>
+                <w:bCs w:val="false"/>
+                <w:i w:val="false"/>
+                <w:iCs w:val="false"/>
+                <w:color w:val="111111"/>
+                <w:sz w:val="22"/>
+                <w:szCs w:val="22"/>
+              </w:rPr>
+              <w:t>หนูเก็บสร้างงาน (เปิดการ์ดห้องทีม) · หนูเก็บคู่มือทีม · หนูเก็บผูกทีม · หนูเก็บยกเลิกผูกทีม · หนูเก็บไอดีกลุ่ม (คำสั่งเปิด/ปิดแจ้งเตือนถูกยกเลิกแล้ว — กลุ่มเก็บไฟล์เงียบเสมอ)</w:t>
             </w:r>
           </w:p>
         </w:tc>
@@ -31474,58 +31669,60 @@
         <w:tc>
           <w:tcPr>
             <w:tcW w:type="dxa" w:w="2800"/>
-            <w:tcMar>
-              <w:top w:type="dxa" w:w="60"/>
-              <w:left w:type="dxa" w:w="100"/>
-              <w:bottom w:type="dxa" w:w="60"/>
-              <w:right w:type="dxa" w:w="100"/>
-            </w:tcMar>
-          </w:tcPr>
-          <w:p>
-            <w:pPr>
-              <w:spacing w:after="40"/>
-            </w:pPr>
-            <w:r>
-              <w:rPr>
-                <w:rFonts w:ascii="Leelawad UI" w:cs="Leelawad UI" w:eastAsia="Leelawad UI" w:hAnsi="Leelawad UI"/>
-                <w:b w:val="false"/>
-                <w:bCs w:val="false"/>
-                <w:i w:val="false"/>
-                <w:iCs w:val="false"/>
-                <w:color w:val="111111"/>
-                <w:sz w:val="22"/>
-                <w:szCs w:val="22"/>
-              </w:rPr>
-              <w:t xml:space="preserve">ตามงาน (ในกลุ่ม)</w:t>
+            <w:shd w:fill="FAFAFA" w:val="clear"/>
+            <w:tcMar>
+              <w:top w:type="dxa" w:w="60"/>
+              <w:left w:type="dxa" w:w="100"/>
+              <w:bottom w:type="dxa" w:w="60"/>
+              <w:right w:type="dxa" w:w="100"/>
+            </w:tcMar>
+          </w:tcPr>
+          <w:p>
+            <w:pPr>
+              <w:spacing w:after="40"/>
+            </w:pPr>
+            <w:r>
+              <w:rPr>
+                <w:rFonts w:ascii="Leelawad UI" w:cs="Leelawad UI" w:eastAsia="Leelawad UI" w:hAnsi="Leelawad UI"/>
+                <w:b w:val="false"/>
+                <w:bCs w:val="false"/>
+                <w:i w:val="false"/>
+                <w:iCs w:val="false"/>
+                <w:color w:val="111111"/>
+                <w:sz w:val="22"/>
+                <w:szCs w:val="22"/>
+              </w:rPr>
+              <w:t xml:space="preserve">ชวนเพื่อน</w:t>
             </w:r>
           </w:p>
         </w:tc>
         <w:tc>
           <w:tcPr>
             <w:tcW w:type="dxa" w:w="6226"/>
-            <w:tcMar>
-              <w:top w:type="dxa" w:w="60"/>
-              <w:left w:type="dxa" w:w="100"/>
-              <w:bottom w:type="dxa" w:w="60"/>
-              <w:right w:type="dxa" w:w="100"/>
-            </w:tcMar>
-          </w:tcPr>
-          <w:p>
-            <w:pPr>
-              <w:spacing w:after="40"/>
-            </w:pPr>
-            <w:r>
-              <w:rPr>
-                <w:rFonts w:ascii="Leelawad UI" w:cs="Leelawad UI" w:eastAsia="Leelawad UI" w:hAnsi="Leelawad UI"/>
-                <w:b w:val="false"/>
-                <w:bCs w:val="false"/>
-                <w:i w:val="false"/>
-                <w:iCs w:val="false"/>
-                <w:color w:val="111111"/>
-                <w:sz w:val="22"/>
-                <w:szCs w:val="22"/>
-              </w:rPr>
-              <w:t xml:space="preserve">ไม่ใช่คำสั่งพิมพ์ — เปิดหน้าสร้างงาน (LIFF) จากปุ่มในกลุ่ม/การ์ดงาน แล้วกดปุ่ม "รับงาน/เสร็จแล้ว" บนการ์ด</w:t>
+            <w:shd w:fill="FAFAFA" w:val="clear"/>
+            <w:tcMar>
+              <w:top w:type="dxa" w:w="60"/>
+              <w:left w:type="dxa" w:w="100"/>
+              <w:bottom w:type="dxa" w:w="60"/>
+              <w:right w:type="dxa" w:w="100"/>
+            </w:tcMar>
+          </w:tcPr>
+          <w:p>
+            <w:pPr>
+              <w:spacing w:after="40"/>
+            </w:pPr>
+            <w:r>
+              <w:rPr>
+                <w:rFonts w:ascii="Leelawad UI" w:cs="Leelawad UI" w:eastAsia="Leelawad UI" w:hAnsi="Leelawad UI"/>
+                <w:b w:val="false"/>
+                <w:bCs w:val="false"/>
+                <w:i w:val="false"/>
+                <w:iCs w:val="false"/>
+                <w:color w:val="111111"/>
+                <w:sz w:val="22"/>
+                <w:szCs w:val="22"/>
+              </w:rPr>
+              <w:t>หนูเก็บเชิญ (ดูโค้ดตัวเอง) · หนูเก็บกรอกโค้ด [โค้ด]</w:t>
             </w:r>
           </w:p>
         </w:tc>
@@ -31534,60 +31731,120 @@
         <w:tc>
           <w:tcPr>
             <w:tcW w:type="dxa" w:w="2800"/>
-            <w:shd w:fill="FAFAFA" w:val="clear"/>
-            <w:tcMar>
-              <w:top w:type="dxa" w:w="60"/>
-              <w:left w:type="dxa" w:w="100"/>
-              <w:bottom w:type="dxa" w:w="60"/>
-              <w:right w:type="dxa" w:w="100"/>
-            </w:tcMar>
-          </w:tcPr>
-          <w:p>
-            <w:pPr>
-              <w:spacing w:after="40"/>
-            </w:pPr>
-            <w:r>
-              <w:rPr>
-                <w:rFonts w:ascii="Leelawad UI" w:cs="Leelawad UI" w:eastAsia="Leelawad UI" w:hAnsi="Leelawad UI"/>
-                <w:b w:val="false"/>
-                <w:bCs w:val="false"/>
-                <w:i w:val="false"/>
-                <w:iCs w:val="false"/>
-                <w:color w:val="111111"/>
-                <w:sz w:val="22"/>
-                <w:szCs w:val="22"/>
-              </w:rPr>
-              <w:t xml:space="preserve">เฉพาะบนเว็บ (ไม่มีคำสั่งแชท)</w:t>
+            <w:tcMar>
+              <w:top w:type="dxa" w:w="60"/>
+              <w:left w:type="dxa" w:w="100"/>
+              <w:bottom w:type="dxa" w:w="60"/>
+              <w:right w:type="dxa" w:w="100"/>
+            </w:tcMar>
+          </w:tcPr>
+          <w:p>
+            <w:pPr>
+              <w:spacing w:after="40"/>
+            </w:pPr>
+            <w:r>
+              <w:rPr>
+                <w:rFonts w:ascii="Leelawad UI" w:cs="Leelawad UI" w:eastAsia="Leelawad UI" w:hAnsi="Leelawad UI"/>
+                <w:b w:val="false"/>
+                <w:bCs w:val="false"/>
+                <w:i w:val="false"/>
+                <w:iCs w:val="false"/>
+                <w:color w:val="111111"/>
+                <w:sz w:val="22"/>
+                <w:szCs w:val="22"/>
+              </w:rPr>
+              <w:t>ตามงาน (กลุ่ม &amp; งานส่วนตัว)</w:t>
             </w:r>
           </w:p>
         </w:tc>
         <w:tc>
           <w:tcPr>
             <w:tcW w:type="dxa" w:w="6226"/>
-            <w:shd w:fill="FAFAFA" w:val="clear"/>
-            <w:tcMar>
-              <w:top w:type="dxa" w:w="60"/>
-              <w:left w:type="dxa" w:w="100"/>
-              <w:bottom w:type="dxa" w:w="60"/>
-              <w:right w:type="dxa" w:w="100"/>
-            </w:tcMar>
-          </w:tcPr>
-          <w:p>
-            <w:pPr>
-              <w:spacing w:after="40"/>
-            </w:pPr>
-            <w:r>
-              <w:rPr>
-                <w:rFonts w:ascii="Leelawad UI" w:cs="Leelawad UI" w:eastAsia="Leelawad UI" w:hAnsi="Leelawad UI"/>
-                <w:b w:val="false"/>
-                <w:bCs w:val="false"/>
-                <w:i w:val="false"/>
-                <w:iCs w:val="false"/>
-                <w:color w:val="111111"/>
-                <w:sz w:val="22"/>
-                <w:szCs w:val="22"/>
-              </w:rPr>
-              <w:t xml:space="preserve">ห้องนิรภัย · กล่องของขวัญ · ถังขยะ — ทำผ่านแดชบอร์ดเว็บเท่านั้น</w:t>
+            <w:tcMar>
+              <w:top w:type="dxa" w:w="60"/>
+              <w:left w:type="dxa" w:w="100"/>
+              <w:bottom w:type="dxa" w:w="60"/>
+              <w:right w:type="dxa" w:w="100"/>
+            </w:tcMar>
+          </w:tcPr>
+          <w:p>
+            <w:pPr>
+              <w:spacing w:after="40"/>
+            </w:pPr>
+            <w:r>
+              <w:rPr>
+                <w:rFonts w:ascii="Leelawad UI" w:cs="Leelawad UI" w:eastAsia="Leelawad UI" w:hAnsi="Leelawad UI"/>
+                <w:b w:val="false"/>
+                <w:bCs w:val="false"/>
+                <w:i w:val="false"/>
+                <w:iCs w:val="false"/>
+                <w:color w:val="111111"/>
+                <w:sz w:val="22"/>
+                <w:szCs w:val="22"/>
+              </w:rPr>
+              <w:t>หนูเก็บสร้างงาน — ในกลุ่มได้การ์ด "ห้องทีม" (เปิดห้องทีม / สร้างงานใหม่) · ในแชทส่วนตัวได้การ์ดสร้าง "งานส่วนตัว" · กรอกรายละเอียดในหน้าเว็บ LIFF แล้วกดปุ่ม "รับงาน/เสร็จแล้ว" บนการ์ดงานในแชท · หนูเก็บลงทะเบียน (คำสั่งเก่า ไม่ต้องพิมพ์แล้ว — หนูเก็บจำสมาชิกกลุ่มให้เอง)</w:t>
+            </w:r>
+          </w:p>
+        </w:tc>
+      </w:tr>
+      <w:tr>
+        <w:tc>
+          <w:tcPr>
+            <w:tcW w:type="dxa" w:w="2800"/>
+            <w:shd w:fill="FAFAFA" w:val="clear"/>
+            <w:tcMar>
+              <w:top w:type="dxa" w:w="60"/>
+              <w:left w:type="dxa" w:w="100"/>
+              <w:bottom w:type="dxa" w:w="60"/>
+              <w:right w:type="dxa" w:w="100"/>
+            </w:tcMar>
+          </w:tcPr>
+          <w:p>
+            <w:pPr>
+              <w:spacing w:after="40"/>
+            </w:pPr>
+            <w:r>
+              <w:rPr>
+                <w:rFonts w:ascii="Leelawad UI" w:cs="Leelawad UI" w:eastAsia="Leelawad UI" w:hAnsi="Leelawad UI"/>
+                <w:b w:val="false"/>
+                <w:bCs w:val="false"/>
+                <w:i w:val="false"/>
+                <w:iCs w:val="false"/>
+                <w:color w:val="111111"/>
+                <w:sz w:val="22"/>
+                <w:szCs w:val="22"/>
+              </w:rPr>
+              <w:t>ฟีเจอร์บนเว็บ (แชทมีคำสั่งเปิดลิงก์ให้)</w:t>
+            </w:r>
+          </w:p>
+        </w:tc>
+        <w:tc>
+          <w:tcPr>
+            <w:tcW w:type="dxa" w:w="6226"/>
+            <w:shd w:fill="FAFAFA" w:val="clear"/>
+            <w:tcMar>
+              <w:top w:type="dxa" w:w="60"/>
+              <w:left w:type="dxa" w:w="100"/>
+              <w:bottom w:type="dxa" w:w="60"/>
+              <w:right w:type="dxa" w:w="100"/>
+            </w:tcMar>
+          </w:tcPr>
+          <w:p>
+            <w:pPr>
+              <w:spacing w:after="40"/>
+            </w:pPr>
+            <w:r>
+              <w:rPr>
+                <w:rFonts w:ascii="Leelawad UI" w:cs="Leelawad UI" w:eastAsia="Leelawad UI" w:hAnsi="Leelawad UI"/>
+                <w:b w:val="false"/>
+                <w:bCs w:val="false"/>
+                <w:i w:val="false"/>
+                <w:iCs w:val="false"/>
+                <w:color w:val="111111"/>
+                <w:sz w:val="22"/>
+                <w:szCs w:val="22"/>
+              </w:rPr>
+              <w:t>หนูเก็บห้องนิรภัย · หนูเก็บกล่องของขวัญ · หนูเก็บงานของฉัน — คำสั่งเหล่านี้ส่งลิงก์เปิดหน้าเว็บให้ (ตัวฟีเจอร์ทำบนเว็บ) · ถังขยะยังไม่มีคำสั่งลัด เข้าจากแดชบอร์ดเว็บ</w:t>
             </w:r>
           </w:p>
         </w:tc>
@@ -32021,7 +32278,7 @@
                 <w:sz w:val="22"/>
                 <w:szCs w:val="22"/>
               </w:rPr>
-              <w:t xml:space="preserve">โหมดรวมรูป / ระบบสแกน / ระบบแปลงไฟล์</w:t>
+              <w:t>โหมดรวมรูป / ระบบสแกน / ระบบรวมไฟล์ / ระบบแปลงไฟล์</w:t>
             </w:r>
           </w:p>
         </w:tc>
@@ -32051,7 +32308,7 @@
                 <w:sz w:val="22"/>
                 <w:szCs w:val="22"/>
               </w:rPr>
-              <w:t xml:space="preserve">ชื่อทางการของ 3 โหมดตามการ์ดในแชทจริง</w:t>
+              <w:t>ชื่อทางการของ 4 โหมดเอกสารตามการ์ดในแชทจริง</w:t>
             </w:r>
           </w:p>
         </w:tc>
@@ -32503,7 +32760,7 @@
                 <w:sz w:val="22"/>
                 <w:szCs w:val="22"/>
               </w:rPr>
-              <w:t xml:space="preserve">ชื่อทางการของฟีเจอร์สร้าง–มอบหมาย–ตามงานในกลุ่ม (Task Manager)</w:t>
+              <w:t>ชื่อทางการของฟีเจอร์สร้าง–มอบหมาย–ตามงาน ทั้งในกลุ่มและงานส่วนตัวในแชทเดี่ยว (Task Manager) · เข้าด้วยคำสั่ง "หนูเก็บสร้างงาน"</w:t>
             </w:r>
           </w:p>
         </w:tc>
@@ -32895,6 +33152,273 @@
                 <w:szCs w:val="22"/>
               </w:rPr>
               <w:t xml:space="preserve">คุณลูกค้า / ท่านผู้ใช้</w:t>
+            </w:r>
+          </w:p>
+        </w:tc>
+      </w:tr>
+      <w:tr>
+        <w:tc>
+          <w:tcPr>
+            <w:tcW w:type="dxa" w:w="2400"/>
+            <w:tcMar>
+              <w:top w:type="dxa" w:w="60"/>
+              <w:left w:type="dxa" w:w="100"/>
+              <w:bottom w:type="dxa" w:w="60"/>
+              <w:right w:type="dxa" w:w="100"/>
+            </w:tcMar>
+          </w:tcPr>
+          <w:p>
+            <w:pPr>
+              <w:spacing w:after="40"/>
+            </w:pPr>
+            <w:r>
+              <w:rPr>
+                <w:rFonts w:ascii="Leelawad UI" w:cs="Leelawad UI" w:eastAsia="Leelawad UI" w:hAnsi="Leelawad UI"/>
+                <w:b w:val="false"/>
+                <w:bCs w:val="false"/>
+                <w:i w:val="false"/>
+                <w:iCs w:val="false"/>
+                <w:color w:val="111111"/>
+                <w:sz w:val="22"/>
+                <w:szCs w:val="22"/>
+              </w:rPr>
+              <w:t>งานส่วนตัว (ใหม่)</w:t>
+            </w:r>
+          </w:p>
+        </w:tc>
+        <w:tc>
+          <w:tcPr>
+            <w:tcW w:type="dxa" w:w="4000"/>
+            <w:tcMar>
+              <w:top w:type="dxa" w:w="60"/>
+              <w:left w:type="dxa" w:w="100"/>
+              <w:bottom w:type="dxa" w:w="60"/>
+              <w:right w:type="dxa" w:w="100"/>
+            </w:tcMar>
+          </w:tcPr>
+          <w:p>
+            <w:pPr>
+              <w:spacing w:after="40"/>
+            </w:pPr>
+            <w:r>
+              <w:rPr>
+                <w:rFonts w:ascii="Leelawad UI" w:cs="Leelawad UI" w:eastAsia="Leelawad UI" w:hAnsi="Leelawad UI"/>
+                <w:b w:val="false"/>
+                <w:bCs w:val="false"/>
+                <w:i w:val="false"/>
+                <w:iCs w:val="false"/>
+                <w:color w:val="111111"/>
+                <w:sz w:val="22"/>
+                <w:szCs w:val="22"/>
+              </w:rPr>
+              <w:t>งานที่สร้างในแชทส่วนตัวกับหนูเก็บ มีแค่เจ้าของคนเดียว ไม่มีการประกาศเข้ากลุ่ม</w:t>
+            </w:r>
+          </w:p>
+        </w:tc>
+        <w:tc>
+          <w:tcPr>
+            <w:tcW w:type="dxa" w:w="2626"/>
+            <w:tcMar>
+              <w:top w:type="dxa" w:w="60"/>
+              <w:left w:type="dxa" w:w="100"/>
+              <w:bottom w:type="dxa" w:w="60"/>
+              <w:right w:type="dxa" w:w="100"/>
+            </w:tcMar>
+          </w:tcPr>
+          <w:p>
+            <w:pPr>
+              <w:spacing w:after="40"/>
+            </w:pPr>
+            <w:r>
+              <w:rPr>
+                <w:rFonts w:ascii="Leelawad UI" w:cs="Leelawad UI" w:eastAsia="Leelawad UI" w:hAnsi="Leelawad UI"/>
+                <w:b w:val="false"/>
+                <w:bCs w:val="false"/>
+                <w:i w:val="false"/>
+                <w:iCs w:val="false"/>
+                <w:color w:val="111111"/>
+                <w:sz w:val="22"/>
+                <w:szCs w:val="22"/>
+              </w:rPr>
+              <w:t>to-do ส่วนตัว / งานเดี่ยว (ซ้ำกับชื่อแบบงาน)</w:t>
+            </w:r>
+          </w:p>
+        </w:tc>
+      </w:tr>
+      <w:tr>
+        <w:tc>
+          <w:tcPr>
+            <w:tcW w:type="dxa" w:w="2400"/>
+            <w:tcMar>
+              <w:top w:type="dxa" w:w="60"/>
+              <w:left w:type="dxa" w:w="100"/>
+              <w:bottom w:type="dxa" w:w="60"/>
+              <w:right w:type="dxa" w:w="100"/>
+            </w:tcMar>
+          </w:tcPr>
+          <w:p>
+            <w:pPr>
+              <w:spacing w:after="40"/>
+            </w:pPr>
+            <w:r>
+              <w:rPr>
+                <w:rFonts w:ascii="Leelawad UI" w:cs="Leelawad UI" w:eastAsia="Leelawad UI" w:hAnsi="Leelawad UI"/>
+                <w:b w:val="false"/>
+                <w:bCs w:val="false"/>
+                <w:i w:val="false"/>
+                <w:iCs w:val="false"/>
+                <w:color w:val="111111"/>
+                <w:sz w:val="22"/>
+                <w:szCs w:val="22"/>
+              </w:rPr>
+              <w:t>ห้องทีม (ใหม่)</w:t>
+            </w:r>
+          </w:p>
+        </w:tc>
+        <w:tc>
+          <w:tcPr>
+            <w:tcW w:type="dxa" w:w="4000"/>
+            <w:tcMar>
+              <w:top w:type="dxa" w:w="60"/>
+              <w:left w:type="dxa" w:w="100"/>
+              <w:bottom w:type="dxa" w:w="60"/>
+              <w:right w:type="dxa" w:w="100"/>
+            </w:tcMar>
+          </w:tcPr>
+          <w:p>
+            <w:pPr>
+              <w:spacing w:after="40"/>
+            </w:pPr>
+            <w:r>
+              <w:rPr>
+                <w:rFonts w:ascii="Leelawad UI" w:cs="Leelawad UI" w:eastAsia="Leelawad UI" w:hAnsi="Leelawad UI"/>
+                <w:b w:val="false"/>
+                <w:bCs w:val="false"/>
+                <w:i w:val="false"/>
+                <w:iCs w:val="false"/>
+                <w:color w:val="111111"/>
+                <w:sz w:val="22"/>
+                <w:szCs w:val="22"/>
+              </w:rPr>
+              <w:t>หน้ารวมงานทั้งหมดของกลุ่มไลน์นั้น เปิดจากการ์ดในกลุ่มหรือจากแดชบอร์ด</w:t>
+            </w:r>
+          </w:p>
+        </w:tc>
+        <w:tc>
+          <w:tcPr>
+            <w:tcW w:type="dxa" w:w="2626"/>
+            <w:tcMar>
+              <w:top w:type="dxa" w:w="60"/>
+              <w:left w:type="dxa" w:w="100"/>
+              <w:bottom w:type="dxa" w:w="60"/>
+              <w:right w:type="dxa" w:w="100"/>
+            </w:tcMar>
+          </w:tcPr>
+          <w:p>
+            <w:pPr>
+              <w:spacing w:after="40"/>
+            </w:pPr>
+            <w:r>
+              <w:rPr>
+                <w:rFonts w:ascii="Leelawad UI" w:cs="Leelawad UI" w:eastAsia="Leelawad UI" w:hAnsi="Leelawad UI"/>
+                <w:b w:val="false"/>
+                <w:bCs w:val="false"/>
+                <w:i w:val="false"/>
+                <w:iCs w:val="false"/>
+                <w:color w:val="111111"/>
+                <w:sz w:val="22"/>
+                <w:szCs w:val="22"/>
+              </w:rPr>
+              <w:t>บอร์ด / โปรเจกต์ / workspace</w:t>
+            </w:r>
+          </w:p>
+        </w:tc>
+      </w:tr>
+      <w:tr>
+        <w:tc>
+          <w:tcPr>
+            <w:tcW w:type="dxa" w:w="2400"/>
+            <w:tcMar>
+              <w:top w:type="dxa" w:w="60"/>
+              <w:left w:type="dxa" w:w="100"/>
+              <w:bottom w:type="dxa" w:w="60"/>
+              <w:right w:type="dxa" w:w="100"/>
+            </w:tcMar>
+          </w:tcPr>
+          <w:p>
+            <w:pPr>
+              <w:spacing w:after="40"/>
+            </w:pPr>
+            <w:r>
+              <w:rPr>
+                <w:rFonts w:ascii="Leelawad UI" w:cs="Leelawad UI" w:eastAsia="Leelawad UI" w:hAnsi="Leelawad UI"/>
+                <w:b w:val="false"/>
+                <w:bCs w:val="false"/>
+                <w:i w:val="false"/>
+                <w:iCs w:val="false"/>
+                <w:color w:val="111111"/>
+                <w:sz w:val="22"/>
+                <w:szCs w:val="22"/>
+              </w:rPr>
+              <w:t>รวมไฟล์ (ใหม่)</w:t>
+            </w:r>
+          </w:p>
+        </w:tc>
+        <w:tc>
+          <w:tcPr>
+            <w:tcW w:type="dxa" w:w="4000"/>
+            <w:tcMar>
+              <w:top w:type="dxa" w:w="60"/>
+              <w:left w:type="dxa" w:w="100"/>
+              <w:bottom w:type="dxa" w:w="60"/>
+              <w:right w:type="dxa" w:w="100"/>
+            </w:tcMar>
+          </w:tcPr>
+          <w:p>
+            <w:pPr>
+              <w:spacing w:after="40"/>
+            </w:pPr>
+            <w:r>
+              <w:rPr>
+                <w:rFonts w:ascii="Leelawad UI" w:cs="Leelawad UI" w:eastAsia="Leelawad UI" w:hAnsi="Leelawad UI"/>
+                <w:b w:val="false"/>
+                <w:bCs w:val="false"/>
+                <w:i w:val="false"/>
+                <w:iCs w:val="false"/>
+                <w:color w:val="111111"/>
+                <w:sz w:val="22"/>
+                <w:szCs w:val="22"/>
+              </w:rPr>
+              <w:t>การรวม PDF หลายไฟล์เป็นไฟล์เดียว (คนละอย่างกับ "รวมรูป" ที่รวมรูปภาพ)</w:t>
+            </w:r>
+          </w:p>
+        </w:tc>
+        <w:tc>
+          <w:tcPr>
+            <w:tcW w:type="dxa" w:w="2626"/>
+            <w:tcMar>
+              <w:top w:type="dxa" w:w="60"/>
+              <w:left w:type="dxa" w:w="100"/>
+              <w:bottom w:type="dxa" w:w="60"/>
+              <w:right w:type="dxa" w:w="100"/>
+            </w:tcMar>
+          </w:tcPr>
+          <w:p>
+            <w:pPr>
+              <w:spacing w:after="40"/>
+            </w:pPr>
+            <w:r>
+              <w:rPr>
+                <w:rFonts w:ascii="Leelawad UI" w:cs="Leelawad UI" w:eastAsia="Leelawad UI" w:hAnsi="Leelawad UI"/>
+                <w:b w:val="false"/>
+                <w:bCs w:val="false"/>
+                <w:i w:val="false"/>
+                <w:iCs w:val="false"/>
+                <w:color w:val="111111"/>
+                <w:sz w:val="22"/>
+                <w:szCs w:val="22"/>
+              </w:rPr>
+              <w:t>merge PDF / รวมรูป (สลับกันไม่ได้)</w:t>
             </w:r>
           </w:p>
         </w:tc>

</xml_diff>